<commit_message>
update so do phan cap week 2
</commit_message>
<xml_diff>
--- a/DOC/2_ApplicationDevelopment_QAs.docx
+++ b/DOC/2_ApplicationDevelopment_QAs.docx
@@ -1322,7 +1322,6 @@
           <w:sz w:val="26"/>
           <w:szCs w:val="26"/>
         </w:rPr>
-        <w:lastRenderedPageBreak/>
         <w:t>Việc quản lý thủ công gây khó khăn trong việc tra cứu lịch sử giao dịch, tính tổng tiền và theo dõi doanh thu.</w:t>
       </w:r>
     </w:p>
@@ -1349,6 +1348,7 @@
           <w:sz w:val="26"/>
           <w:szCs w:val="26"/>
         </w:rPr>
+        <w:lastRenderedPageBreak/>
         <w:t>Quản lý khách hàng</w:t>
       </w:r>
     </w:p>
@@ -1870,7 +1870,6 @@
           <w:sz w:val="26"/>
           <w:szCs w:val="26"/>
         </w:rPr>
-        <w:lastRenderedPageBreak/>
         <w:t>Qua khảo sát ban đầu, ứng dụng cần tập trung giải quyết các nhóm vấn đề:</w:t>
       </w:r>
     </w:p>
@@ -1913,6 +1912,7 @@
           <w:sz w:val="26"/>
           <w:szCs w:val="26"/>
         </w:rPr>
+        <w:lastRenderedPageBreak/>
         <w:t>Khó kiểm soát số lượng hàng tồn kho.</w:t>
       </w:r>
     </w:p>
@@ -2450,25 +2450,46 @@
           <w:sz w:val="26"/>
           <w:szCs w:val="26"/>
         </w:rPr>
+        <w:t>– Nếu thông tin đăng nhập không chính xác hoặc tài khoản đã bị khóa, hệ thống thông báo lỗi và yêu cầu người dùng kiểm tra lại thông tin.</w:t>
+      </w:r>
+    </w:p>
+    <w:p>
+      <w:pPr>
+        <w:rPr>
+          <w:rFonts w:ascii="Times New Roman" w:hAnsi="Times New Roman" w:cs="Times New Roman"/>
+          <w:sz w:val="26"/>
+          <w:szCs w:val="26"/>
+        </w:rPr>
+      </w:pPr>
+    </w:p>
+    <w:p>
+      <w:pPr>
+        <w:rPr>
+          <w:rFonts w:ascii="Times New Roman" w:hAnsi="Times New Roman" w:cs="Times New Roman"/>
+          <w:b/>
+          <w:bCs/>
+          <w:sz w:val="26"/>
+          <w:szCs w:val="26"/>
+          <w:lang w:val="vi-VN"/>
+        </w:rPr>
+      </w:pPr>
+      <w:r>
+        <w:rPr>
+          <w:rFonts w:ascii="Times New Roman" w:hAnsi="Times New Roman" w:cs="Times New Roman"/>
+          <w:b/>
+          <w:bCs/>
+          <w:sz w:val="26"/>
+          <w:szCs w:val="26"/>
+          <w:lang w:val="vi-VN"/>
+        </w:rPr>
         <w:lastRenderedPageBreak/>
-        <w:t>– Nếu thông tin đăng nhập không chính xác hoặc tài khoản đã bị khóa, hệ thống thông báo lỗi và yêu cầu người dùng kiểm tra lại thông tin.</w:t>
-      </w:r>
-    </w:p>
-    <w:p>
-      <w:pPr>
-        <w:rPr>
-          <w:rFonts w:ascii="Times New Roman" w:hAnsi="Times New Roman" w:cs="Times New Roman"/>
-          <w:sz w:val="26"/>
-          <w:szCs w:val="26"/>
-        </w:rPr>
-      </w:pPr>
-    </w:p>
-    <w:p>
-      <w:pPr>
-        <w:rPr>
-          <w:rFonts w:ascii="Times New Roman" w:hAnsi="Times New Roman" w:cs="Times New Roman"/>
-          <w:b/>
-          <w:bCs/>
+        <w:t>Quy trình nghiệp vụ của chức năng quản lý sản phẩm</w:t>
+      </w:r>
+    </w:p>
+    <w:p>
+      <w:pPr>
+        <w:rPr>
+          <w:rFonts w:ascii="Times New Roman" w:hAnsi="Times New Roman" w:cs="Times New Roman"/>
           <w:sz w:val="26"/>
           <w:szCs w:val="26"/>
           <w:lang w:val="vi-VN"/>
@@ -2477,24 +2498,21 @@
       <w:r>
         <w:rPr>
           <w:rFonts w:ascii="Times New Roman" w:hAnsi="Times New Roman" w:cs="Times New Roman"/>
-          <w:b/>
-          <w:bCs/>
           <w:sz w:val="26"/>
           <w:szCs w:val="26"/>
           <w:lang w:val="vi-VN"/>
         </w:rPr>
-        <w:t>Quy trình nghiệp vụ của chức năng quản lý sản phẩm</w:t>
-      </w:r>
-    </w:p>
-    <w:p>
-      <w:pPr>
+        <w:t xml:space="preserve">– Admin hoặc Nhân viên đăng nhập vào hệ thống và chọn chức </w:t>
+      </w:r>
+      <w:r>
         <w:rPr>
           <w:rFonts w:ascii="Times New Roman" w:hAnsi="Times New Roman" w:cs="Times New Roman"/>
           <w:sz w:val="26"/>
           <w:szCs w:val="26"/>
           <w:lang w:val="vi-VN"/>
         </w:rPr>
-      </w:pPr>
+        <w:t xml:space="preserve">năng “Quản lý sản phẩm”. Người dùng có quyền quản lý sản phẩm có thể thực hiện các thao tác thêm, sửa, xóa và tìm kiếm </w:t>
+      </w:r>
       <w:r>
         <w:rPr>
           <w:rFonts w:ascii="Times New Roman" w:hAnsi="Times New Roman" w:cs="Times New Roman"/>
@@ -2502,17 +2520,18 @@
           <w:szCs w:val="26"/>
           <w:lang w:val="vi-VN"/>
         </w:rPr>
-        <w:t xml:space="preserve">– Admin hoặc Nhân viên đăng nhập vào hệ thống và chọn chức </w:t>
-      </w:r>
-      <w:r>
+        <w:t>sản phẩm.</w:t>
+      </w:r>
+    </w:p>
+    <w:p>
+      <w:pPr>
         <w:rPr>
           <w:rFonts w:ascii="Times New Roman" w:hAnsi="Times New Roman" w:cs="Times New Roman"/>
           <w:sz w:val="26"/>
           <w:szCs w:val="26"/>
           <w:lang w:val="vi-VN"/>
         </w:rPr>
-        <w:t xml:space="preserve">năng “Quản lý sản phẩm”. Người dùng có quyền quản lý sản phẩm có thể thực hiện các thao tác thêm, sửa, xóa và tìm kiếm </w:t>
-      </w:r>
+      </w:pPr>
       <w:r>
         <w:rPr>
           <w:rFonts w:ascii="Times New Roman" w:hAnsi="Times New Roman" w:cs="Times New Roman"/>
@@ -2520,13 +2539,15 @@
           <w:szCs w:val="26"/>
           <w:lang w:val="vi-VN"/>
         </w:rPr>
-        <w:t>sản phẩm.</w:t>
-      </w:r>
-    </w:p>
-    <w:p>
-      <w:pPr>
-        <w:rPr>
-          <w:rFonts w:ascii="Times New Roman" w:hAnsi="Times New Roman" w:cs="Times New Roman"/>
+        <w:t>– Sau khi người dùng nhập hoặc thay đổi thông tin sản phẩm, hệ thống kiểm tra tính hợp lệ của dữ liệu. Nếu thông tin hợp lệ, hệ thống lưu dữ liệu vào cơ sở dữ liệu và cập nhật lại danh sách sản phẩm. Nếu thông tin không hợp lệ, hệ thống thông báo lỗi và yêu cầu người dùng chỉnh sửa.</w:t>
+      </w:r>
+    </w:p>
+    <w:p>
+      <w:pPr>
+        <w:rPr>
+          <w:rFonts w:ascii="Times New Roman" w:hAnsi="Times New Roman" w:cs="Times New Roman"/>
+          <w:b/>
+          <w:bCs/>
           <w:sz w:val="26"/>
           <w:szCs w:val="26"/>
           <w:lang w:val="vi-VN"/>
@@ -2535,19 +2556,19 @@
       <w:r>
         <w:rPr>
           <w:rFonts w:ascii="Times New Roman" w:hAnsi="Times New Roman" w:cs="Times New Roman"/>
+          <w:b/>
+          <w:bCs/>
           <w:sz w:val="26"/>
           <w:szCs w:val="26"/>
           <w:lang w:val="vi-VN"/>
         </w:rPr>
-        <w:t>– Sau khi người dùng nhập hoặc thay đổi thông tin sản phẩm, hệ thống kiểm tra tính hợp lệ của dữ liệu. Nếu thông tin hợp lệ, hệ thống lưu dữ liệu vào cơ sở dữ liệu và cập nhật lại danh sách sản phẩm. Nếu thông tin không hợp lệ, hệ thống thông báo lỗi và yêu cầu người dùng chỉnh sửa.</w:t>
-      </w:r>
-    </w:p>
-    <w:p>
-      <w:pPr>
-        <w:rPr>
-          <w:rFonts w:ascii="Times New Roman" w:hAnsi="Times New Roman" w:cs="Times New Roman"/>
-          <w:b/>
-          <w:bCs/>
+        <w:t>Quy trình nghiệp vụ của chức năng nhập hàng</w:t>
+      </w:r>
+    </w:p>
+    <w:p>
+      <w:pPr>
+        <w:rPr>
+          <w:rFonts w:ascii="Times New Roman" w:hAnsi="Times New Roman" w:cs="Times New Roman"/>
           <w:sz w:val="26"/>
           <w:szCs w:val="26"/>
           <w:lang w:val="vi-VN"/>
@@ -2556,13 +2577,11 @@
       <w:r>
         <w:rPr>
           <w:rFonts w:ascii="Times New Roman" w:hAnsi="Times New Roman" w:cs="Times New Roman"/>
-          <w:b/>
-          <w:bCs/>
           <w:sz w:val="26"/>
           <w:szCs w:val="26"/>
           <w:lang w:val="vi-VN"/>
         </w:rPr>
-        <w:t>Quy trình nghiệp vụ của chức năng nhập hàng</w:t>
+        <w:t>– Nhân viên kho tạo yêu cầu nhập hàng, lựa chọn sản phẩm cần nhập và nhập số lượng cùng giá nhập. Sau đó nhà cung cấp giao hàng cho cửa hàng.</w:t>
       </w:r>
     </w:p>
     <w:p>
@@ -2581,166 +2600,273 @@
           <w:szCs w:val="26"/>
           <w:lang w:val="vi-VN"/>
         </w:rPr>
-        <w:t>– Nhân viên kho tạo yêu cầu nhập hàng, lựa chọn sản phẩm cần nhập và nhập số lượng cùng giá nhập. Sau đó nhà cung cấp giao hàng cho cửa hàng.</w:t>
-      </w:r>
-    </w:p>
-    <w:p>
-      <w:pPr>
+        <w:t>– Nhân viên kho kiểm tra số lượng và chất lượng hàng hóa. Nếu hàng đạt yêu cầu, nhân viên lập phiếu nhập gồm mã phiếu, nhà cung cấp, ngày nhập, sản phẩm, số lượng, giá nhập, thành tiền và nhân viên nhập.</w:t>
+      </w:r>
+    </w:p>
+    <w:p>
+      <w:pPr>
+        <w:rPr>
+          <w:rFonts w:ascii="Times New Roman" w:hAnsi="Times New Roman" w:cs="Times New Roman"/>
+          <w:sz w:val="26"/>
+          <w:szCs w:val="26"/>
+        </w:rPr>
+      </w:pPr>
+      <w:r>
         <w:rPr>
           <w:rFonts w:ascii="Times New Roman" w:hAnsi="Times New Roman" w:cs="Times New Roman"/>
           <w:sz w:val="26"/>
           <w:szCs w:val="26"/>
           <w:lang w:val="vi-VN"/>
         </w:rPr>
-      </w:pPr>
-      <w:r>
-        <w:rPr>
-          <w:rFonts w:ascii="Times New Roman" w:hAnsi="Times New Roman" w:cs="Times New Roman"/>
+        <w:t>– Sau khi phiếu nhập được xác nhận, hệ thống cập nhật số lượng tồn kho và lưu lại lịch sử nhập hàng. Nếu hàng không đạt yêu cầu, nhân viên yêu cầu nhà cung cấp xử lý.</w:t>
+      </w:r>
+    </w:p>
+    <w:p>
+      <w:pPr>
+        <w:rPr>
+          <w:rFonts w:ascii="Times New Roman" w:hAnsi="Times New Roman" w:cs="Times New Roman"/>
+          <w:b/>
+          <w:bCs/>
+          <w:sz w:val="26"/>
+          <w:szCs w:val="26"/>
+        </w:rPr>
+      </w:pPr>
+      <w:r>
+        <w:rPr>
+          <w:rFonts w:ascii="Times New Roman" w:hAnsi="Times New Roman" w:cs="Times New Roman"/>
+          <w:b/>
+          <w:bCs/>
+          <w:sz w:val="26"/>
+          <w:szCs w:val="26"/>
+        </w:rPr>
+        <w:t>Quy trình nghiệp vụ của chức năng tạo đơn hàng</w:t>
+      </w:r>
+    </w:p>
+    <w:p>
+      <w:pPr>
+        <w:rPr>
+          <w:rFonts w:ascii="Times New Roman" w:hAnsi="Times New Roman" w:cs="Times New Roman"/>
+          <w:sz w:val="26"/>
+          <w:szCs w:val="26"/>
+        </w:rPr>
+      </w:pPr>
+      <w:r>
+        <w:rPr>
+          <w:rFonts w:ascii="Times New Roman" w:hAnsi="Times New Roman" w:cs="Times New Roman"/>
+          <w:sz w:val="26"/>
+          <w:szCs w:val="26"/>
+        </w:rPr>
+        <w:t xml:space="preserve">– Khi khách hàng mua sản phẩm hoặc thú cưng tại cửa hàng, </w:t>
+      </w:r>
+      <w:r>
+        <w:rPr>
+          <w:rFonts w:ascii="Times New Roman" w:hAnsi="Times New Roman" w:cs="Times New Roman"/>
+          <w:sz w:val="26"/>
+          <w:szCs w:val="26"/>
+        </w:rPr>
+        <w:t>Nhân viên bán hàng tìm kiếm và lựa chọn sản phẩm/thú cưng theo yêu cầu của khách hàng, đồng thời kiểm tra thông tin và số lượng tồn kho.</w:t>
+      </w:r>
+    </w:p>
+    <w:p>
+      <w:pPr>
+        <w:rPr>
+          <w:rFonts w:ascii="Times New Roman" w:hAnsi="Times New Roman" w:cs="Times New Roman"/>
+          <w:sz w:val="26"/>
+          <w:szCs w:val="26"/>
+        </w:rPr>
+      </w:pPr>
+      <w:r>
+        <w:rPr>
+          <w:rFonts w:ascii="Times New Roman" w:hAnsi="Times New Roman" w:cs="Times New Roman"/>
+          <w:sz w:val="26"/>
+          <w:szCs w:val="26"/>
+        </w:rPr>
+        <w:t>– Nhân viên tạo đơn hàng trên hệ thống, lựa chọn khách hàng nếu đã có thông tin hoặc thêm mới khách hàng khi cần. Sau đó, nhân viên thêm các sản phẩm/thú cưng vào đơn hàng và nhập số lượng tương ứng.</w:t>
+      </w:r>
+    </w:p>
+    <w:p>
+      <w:pPr>
+        <w:rPr>
+          <w:rFonts w:ascii="Times New Roman" w:hAnsi="Times New Roman" w:cs="Times New Roman"/>
+          <w:sz w:val="26"/>
+          <w:szCs w:val="26"/>
+        </w:rPr>
+      </w:pPr>
+      <w:r>
+        <w:rPr>
+          <w:rFonts w:ascii="Times New Roman" w:hAnsi="Times New Roman" w:cs="Times New Roman"/>
+          <w:sz w:val="26"/>
+          <w:szCs w:val="26"/>
+        </w:rPr>
+        <w:t>– Hệ thống kiểm tra tính hợp lệ của đơn hàng và số lượng tồn kho. Nếu sản phẩm không đủ số lượng hoặc thông tin chưa hợp lệ, hệ thống thông báo để nhân viên điều chỉnh.</w:t>
+      </w:r>
+    </w:p>
+    <w:p>
+      <w:pPr>
+        <w:rPr>
+          <w:rFonts w:ascii="Times New Roman" w:hAnsi="Times New Roman" w:cs="Times New Roman"/>
+          <w:sz w:val="26"/>
+          <w:szCs w:val="26"/>
+        </w:rPr>
+      </w:pPr>
+      <w:r>
+        <w:rPr>
+          <w:rFonts w:ascii="Times New Roman" w:hAnsi="Times New Roman" w:cs="Times New Roman"/>
+          <w:sz w:val="26"/>
+          <w:szCs w:val="26"/>
+        </w:rPr>
+        <w:t>– Nếu đơn hàng hợp lệ, hệ thống tính tổng tiền, áp dụng chương trình khuyến mãi hoặc mã giảm giá nếu có, sau đó lưu đơn hàng và chuyển sang trạng thái “Chờ thanh toán”.</w:t>
+      </w:r>
+    </w:p>
+    <w:p>
+      <w:pPr>
+        <w:rPr>
+          <w:rFonts w:ascii="Times New Roman" w:hAnsi="Times New Roman" w:cs="Times New Roman"/>
+          <w:sz w:val="26"/>
+          <w:szCs w:val="26"/>
+        </w:rPr>
+      </w:pPr>
+      <w:r>
+        <w:rPr>
+          <w:rFonts w:ascii="Times New Roman" w:hAnsi="Times New Roman" w:cs="Times New Roman"/>
+          <w:sz w:val="26"/>
+          <w:szCs w:val="26"/>
+        </w:rPr>
+        <w:t>– Đơn hàng được chuyển cho Thu ngân để tiếp tục thực hiện thanh to</w:t>
+      </w:r>
+      <w:r>
+        <w:rPr>
+          <w:rFonts w:ascii="Times New Roman" w:hAnsi="Times New Roman" w:cs="Times New Roman"/>
+          <w:sz w:val="26"/>
+          <w:szCs w:val="26"/>
+        </w:rPr>
+        <w:t>án và lập hóa đơn cho khách hàng.</w:t>
+      </w:r>
+    </w:p>
+    <w:p>
+      <w:pPr>
+        <w:rPr>
+          <w:rFonts w:ascii="Times New Roman" w:hAnsi="Times New Roman" w:cs="Times New Roman"/>
+          <w:b/>
+          <w:bCs/>
           <w:sz w:val="26"/>
           <w:szCs w:val="26"/>
           <w:lang w:val="vi-VN"/>
         </w:rPr>
-        <w:t>– Nhân viên kho kiểm tra số lượng và chất lượng hàng hóa. Nếu hàng đạt yêu cầu, nhân viên lập phiếu nhập gồm mã phiếu, nhà cung cấp, ngày nhập, sản phẩm, số lượng, giá nhập, thành tiền và nhân viên nhập.</w:t>
-      </w:r>
-    </w:p>
-    <w:p>
-      <w:pPr>
-        <w:rPr>
-          <w:rFonts w:ascii="Times New Roman" w:hAnsi="Times New Roman" w:cs="Times New Roman"/>
-          <w:sz w:val="26"/>
-          <w:szCs w:val="26"/>
-        </w:rPr>
-      </w:pPr>
-      <w:r>
-        <w:rPr>
-          <w:rFonts w:ascii="Times New Roman" w:hAnsi="Times New Roman" w:cs="Times New Roman"/>
+      </w:pPr>
+      <w:r>
+        <w:rPr>
+          <w:rFonts w:ascii="Times New Roman" w:hAnsi="Times New Roman" w:cs="Times New Roman"/>
+          <w:b/>
+          <w:bCs/>
           <w:sz w:val="26"/>
           <w:szCs w:val="26"/>
           <w:lang w:val="vi-VN"/>
         </w:rPr>
-        <w:t>– Sau khi phiếu nhập được xác nhận, hệ thống cập nhật số lượng tồn kho và lưu lại lịch sử nhập hàng. Nếu hàng không đạt yêu cầu, nhân viên yêu cầu nhà cung cấp xử lý.</w:t>
-      </w:r>
-    </w:p>
-    <w:p>
-      <w:pPr>
-        <w:rPr>
-          <w:rFonts w:ascii="Times New Roman" w:hAnsi="Times New Roman" w:cs="Times New Roman"/>
-          <w:b/>
-          <w:bCs/>
-          <w:sz w:val="26"/>
-          <w:szCs w:val="26"/>
-        </w:rPr>
-      </w:pPr>
-      <w:r>
-        <w:rPr>
-          <w:rFonts w:ascii="Times New Roman" w:hAnsi="Times New Roman" w:cs="Times New Roman"/>
-          <w:b/>
-          <w:bCs/>
-          <w:sz w:val="26"/>
-          <w:szCs w:val="26"/>
-        </w:rPr>
-        <w:t>Quy trình nghiệp vụ của chức năng tạo đơn hàng</w:t>
-      </w:r>
-    </w:p>
-    <w:p>
-      <w:pPr>
-        <w:rPr>
-          <w:rFonts w:ascii="Times New Roman" w:hAnsi="Times New Roman" w:cs="Times New Roman"/>
-          <w:sz w:val="26"/>
-          <w:szCs w:val="26"/>
-        </w:rPr>
-      </w:pPr>
-      <w:r>
-        <w:rPr>
-          <w:rFonts w:ascii="Times New Roman" w:hAnsi="Times New Roman" w:cs="Times New Roman"/>
-          <w:sz w:val="26"/>
-          <w:szCs w:val="26"/>
-        </w:rPr>
-        <w:t xml:space="preserve">– Khi khách hàng mua sản phẩm hoặc thú cưng tại cửa hàng, </w:t>
-      </w:r>
-      <w:r>
-        <w:rPr>
-          <w:rFonts w:ascii="Times New Roman" w:hAnsi="Times New Roman" w:cs="Times New Roman"/>
-          <w:sz w:val="26"/>
-          <w:szCs w:val="26"/>
-        </w:rPr>
-        <w:t>Nhân viên bán hàng tìm kiếm và lựa chọn sản phẩm/thú cưng theo yêu cầu của khách hàng, đồng thời kiểm tra thông tin và số lượng tồn kho.</w:t>
-      </w:r>
-    </w:p>
-    <w:p>
-      <w:pPr>
-        <w:rPr>
-          <w:rFonts w:ascii="Times New Roman" w:hAnsi="Times New Roman" w:cs="Times New Roman"/>
-          <w:sz w:val="26"/>
-          <w:szCs w:val="26"/>
-        </w:rPr>
-      </w:pPr>
-      <w:r>
-        <w:rPr>
-          <w:rFonts w:ascii="Times New Roman" w:hAnsi="Times New Roman" w:cs="Times New Roman"/>
-          <w:sz w:val="26"/>
-          <w:szCs w:val="26"/>
-        </w:rPr>
-        <w:t>– Nhân viên tạo đơn hàng trên hệ thống, lựa chọn khách hàng nếu đã có thông tin hoặc thêm mới khách hàng khi cần. Sau đó, nhân viên thêm các sản phẩm/thú cưng vào đơn hàng và nhập số lượng tương ứng.</w:t>
-      </w:r>
-    </w:p>
-    <w:p>
-      <w:pPr>
-        <w:rPr>
-          <w:rFonts w:ascii="Times New Roman" w:hAnsi="Times New Roman" w:cs="Times New Roman"/>
-          <w:sz w:val="26"/>
-          <w:szCs w:val="26"/>
-        </w:rPr>
-      </w:pPr>
-      <w:r>
-        <w:rPr>
-          <w:rFonts w:ascii="Times New Roman" w:hAnsi="Times New Roman" w:cs="Times New Roman"/>
-          <w:sz w:val="26"/>
-          <w:szCs w:val="26"/>
-        </w:rPr>
-        <w:t>– Hệ thống kiểm tra tính hợp lệ của đơn hàng và số lượng tồn kho. Nếu sản phẩm không đủ số lượng hoặc thông tin chưa hợp lệ, hệ thống thông báo để nhân viên điều chỉnh.</w:t>
-      </w:r>
-    </w:p>
-    <w:p>
-      <w:pPr>
-        <w:rPr>
-          <w:rFonts w:ascii="Times New Roman" w:hAnsi="Times New Roman" w:cs="Times New Roman"/>
-          <w:sz w:val="26"/>
-          <w:szCs w:val="26"/>
-        </w:rPr>
-      </w:pPr>
-      <w:r>
-        <w:rPr>
-          <w:rFonts w:ascii="Times New Roman" w:hAnsi="Times New Roman" w:cs="Times New Roman"/>
-          <w:sz w:val="26"/>
-          <w:szCs w:val="26"/>
-        </w:rPr>
-        <w:t>– Nếu đơn hàng hợp lệ, hệ thống tính tổng tiền, áp dụng chương trình khuyến mãi hoặc mã giảm giá nếu có, sau đó lưu đơn hàng và chuyển sang trạng thái “Chờ thanh toán”.</w:t>
-      </w:r>
-    </w:p>
-    <w:p>
-      <w:pPr>
-        <w:rPr>
-          <w:rFonts w:ascii="Times New Roman" w:hAnsi="Times New Roman" w:cs="Times New Roman"/>
-          <w:sz w:val="26"/>
-          <w:szCs w:val="26"/>
-        </w:rPr>
-      </w:pPr>
-      <w:r>
-        <w:rPr>
-          <w:rFonts w:ascii="Times New Roman" w:hAnsi="Times New Roman" w:cs="Times New Roman"/>
-          <w:sz w:val="26"/>
-          <w:szCs w:val="26"/>
-        </w:rPr>
-        <w:t>– Đơn hàng được chuyển cho Thu ngân để tiếp tục thực hiện thanh to</w:t>
-      </w:r>
-      <w:r>
-        <w:rPr>
-          <w:rFonts w:ascii="Times New Roman" w:hAnsi="Times New Roman" w:cs="Times New Roman"/>
-          <w:sz w:val="26"/>
-          <w:szCs w:val="26"/>
-        </w:rPr>
-        <w:t>án và lập hóa đơn cho khách hàng.</w:t>
+        <w:t>Quy trình nghiệp vụ của chức năng thanh toán</w:t>
+      </w:r>
+    </w:p>
+    <w:p>
+      <w:pPr>
+        <w:rPr>
+          <w:rFonts w:ascii="Times New Roman" w:hAnsi="Times New Roman" w:cs="Times New Roman"/>
+          <w:sz w:val="26"/>
+          <w:szCs w:val="26"/>
+        </w:rPr>
+      </w:pPr>
+      <w:r>
+        <w:rPr>
+          <w:rFonts w:ascii="Times New Roman" w:hAnsi="Times New Roman" w:cs="Times New Roman"/>
+          <w:sz w:val="26"/>
+          <w:szCs w:val="26"/>
+        </w:rPr>
+        <w:t>– Sau khi nhận đơn hàng từ Nhân viên bán hàng, Thu ngân kiểm tra thông tin đơn hàng. Hệ thống tính tổng tiền và áp dụng chương trình khuyến mãi hoặc mã giảm giá nếu có.</w:t>
+      </w:r>
+    </w:p>
+    <w:p>
+      <w:pPr>
+        <w:rPr>
+          <w:rFonts w:ascii="Times New Roman" w:hAnsi="Times New Roman" w:cs="Times New Roman"/>
+          <w:sz w:val="26"/>
+          <w:szCs w:val="26"/>
+        </w:rPr>
+      </w:pPr>
+      <w:r>
+        <w:rPr>
+          <w:rFonts w:ascii="Times New Roman" w:hAnsi="Times New Roman" w:cs="Times New Roman"/>
+          <w:sz w:val="26"/>
+          <w:szCs w:val="26"/>
+        </w:rPr>
+        <w:t>– Hệ thống hiển thị số tiền khách hàng cần thanh toán. Thu ngân lựa chọn phương thức thanh toán gồm tiền mặt hoặc chuyển khoản bằng mã QR.</w:t>
+      </w:r>
+    </w:p>
+    <w:p>
+      <w:pPr>
+        <w:rPr>
+          <w:rFonts w:ascii="Times New Roman" w:hAnsi="Times New Roman" w:cs="Times New Roman"/>
+          <w:sz w:val="26"/>
+          <w:szCs w:val="26"/>
+        </w:rPr>
+      </w:pPr>
+      <w:r>
+        <w:rPr>
+          <w:rFonts w:ascii="Times New Roman" w:hAnsi="Times New Roman" w:cs="Times New Roman"/>
+          <w:sz w:val="26"/>
+          <w:szCs w:val="26"/>
+        </w:rPr>
+        <w:lastRenderedPageBreak/>
+        <w:t>– Nếu khách hàng thanh toán bằng tiền mặt, Thu ngân nhập số tiền nhận từ khách và hệ thống xác nhận thanh toán sau khi giao dịch hoàn tất.</w:t>
+      </w:r>
+    </w:p>
+    <w:p>
+      <w:pPr>
+        <w:rPr>
+          <w:rFonts w:ascii="Times New Roman" w:hAnsi="Times New Roman" w:cs="Times New Roman"/>
+          <w:sz w:val="26"/>
+          <w:szCs w:val="26"/>
+        </w:rPr>
+      </w:pPr>
+      <w:r>
+        <w:rPr>
+          <w:rFonts w:ascii="Times New Roman" w:hAnsi="Times New Roman" w:cs="Times New Roman"/>
+          <w:sz w:val="26"/>
+          <w:szCs w:val="26"/>
+        </w:rPr>
+        <w:t>– Nếu khách hàng thanh toán bằng chuyển khoản, hệ thống hiển thị hoặc tạo mã QR thanh toán. Sau khi xác nhận đã nhận được khoản thanh toán, Thu ngân xác nhận giao dịch trên hệ thống.</w:t>
+      </w:r>
+    </w:p>
+    <w:p>
+      <w:pPr>
+        <w:rPr>
+          <w:rFonts w:ascii="Times New Roman" w:hAnsi="Times New Roman" w:cs="Times New Roman"/>
+          <w:sz w:val="26"/>
+          <w:szCs w:val="26"/>
+        </w:rPr>
+      </w:pPr>
+      <w:r>
+        <w:rPr>
+          <w:rFonts w:ascii="Times New Roman" w:hAnsi="Times New Roman" w:cs="Times New Roman"/>
+          <w:sz w:val="26"/>
+          <w:szCs w:val="26"/>
+        </w:rPr>
+        <w:t>– Khi thanh toán thành công, hệ thống cập nhật trạng thái đơn hàng thành “Đã thanh toán” hoặc “Hoàn thành”, lưu thông tin thanh toán và cho phép Thu ngân lập, in hóa đơn cho khách hàng.</w:t>
+      </w:r>
+    </w:p>
+    <w:p>
+      <w:pPr>
+        <w:rPr>
+          <w:rFonts w:ascii="Times New Roman" w:hAnsi="Times New Roman" w:cs="Times New Roman"/>
+          <w:sz w:val="26"/>
+          <w:szCs w:val="26"/>
+        </w:rPr>
+      </w:pPr>
+      <w:r>
+        <w:rPr>
+          <w:rFonts w:ascii="Times New Roman" w:hAnsi="Times New Roman" w:cs="Times New Roman"/>
+          <w:sz w:val="26"/>
+          <w:szCs w:val="26"/>
+        </w:rPr>
+        <w:t>– Nếu thanh toán chưa hoàn tất hoặc có lỗi, hệ thống giữ đơn hàng ở trạng thái “Chờ thanh toán” để Thu ngân tiếp tục xử lý.</w:t>
       </w:r>
     </w:p>
     <w:p>
@@ -2763,242 +2889,300 @@
           <w:szCs w:val="26"/>
           <w:lang w:val="vi-VN"/>
         </w:rPr>
-        <w:t>Quy trình nghiệp vụ của chức năng thanh toán</w:t>
-      </w:r>
-    </w:p>
-    <w:p>
-      <w:pPr>
-        <w:rPr>
-          <w:rFonts w:ascii="Times New Roman" w:hAnsi="Times New Roman" w:cs="Times New Roman"/>
-          <w:sz w:val="26"/>
-          <w:szCs w:val="26"/>
-        </w:rPr>
-      </w:pPr>
-      <w:r>
-        <w:rPr>
-          <w:rFonts w:ascii="Times New Roman" w:hAnsi="Times New Roman" w:cs="Times New Roman"/>
-          <w:sz w:val="26"/>
-          <w:szCs w:val="26"/>
+        <w:t>Quy trình nghiệp vụ của chức năng hủy đơn hàng</w:t>
+      </w:r>
+    </w:p>
+    <w:p>
+      <w:pPr>
+        <w:rPr>
+          <w:rFonts w:ascii="Times New Roman" w:hAnsi="Times New Roman" w:cs="Times New Roman"/>
+          <w:sz w:val="26"/>
+          <w:szCs w:val="26"/>
+        </w:rPr>
+      </w:pPr>
+      <w:r>
+        <w:rPr>
+          <w:rFonts w:ascii="Times New Roman" w:hAnsi="Times New Roman" w:cs="Times New Roman"/>
+          <w:sz w:val="26"/>
+          <w:szCs w:val="26"/>
+        </w:rPr>
+        <w:t xml:space="preserve">– Khi khách hàng yêu cầu hủy đơn tại cửa hàng, </w:t>
+      </w:r>
+      <w:r>
+        <w:rPr>
+          <w:rFonts w:ascii="Times New Roman" w:hAnsi="Times New Roman" w:cs="Times New Roman"/>
+          <w:sz w:val="26"/>
+          <w:szCs w:val="26"/>
+        </w:rPr>
+        <w:t>Nhân viên bán hàng hoặc Thu ngân tìm kiếm và lựa chọn đơn hàng cần hủy trên hệ thống.</w:t>
+      </w:r>
+    </w:p>
+    <w:p>
+      <w:pPr>
+        <w:rPr>
+          <w:rFonts w:ascii="Times New Roman" w:hAnsi="Times New Roman" w:cs="Times New Roman"/>
+          <w:sz w:val="26"/>
+          <w:szCs w:val="26"/>
+        </w:rPr>
+      </w:pPr>
+      <w:r>
+        <w:rPr>
+          <w:rFonts w:ascii="Times New Roman" w:hAnsi="Times New Roman" w:cs="Times New Roman"/>
+          <w:sz w:val="26"/>
+          <w:szCs w:val="26"/>
+        </w:rPr>
+        <w:t>– Hệ thống kiểm tra trạng thái hiện tại của đơn hàng. Nếu đơn hàng đang ở trạng thái “Chờ thanh toán”, nhân viên có thể thực hiện hủy đơn và hệ thống cập nhật trạng thái thành “Đã hủy”.</w:t>
+      </w:r>
+    </w:p>
+    <w:p>
+      <w:pPr>
+        <w:rPr>
+          <w:rFonts w:ascii="Times New Roman" w:hAnsi="Times New Roman" w:cs="Times New Roman"/>
+          <w:sz w:val="26"/>
+          <w:szCs w:val="26"/>
+        </w:rPr>
+      </w:pPr>
+      <w:r>
+        <w:rPr>
+          <w:rFonts w:ascii="Times New Roman" w:hAnsi="Times New Roman" w:cs="Times New Roman"/>
+          <w:sz w:val="26"/>
+          <w:szCs w:val="26"/>
+        </w:rPr>
+        <w:t>– Nếu đơn hàng đã được thanh toán, Thu ngân kiểm tra thông tin giao dịch và thực hiện xử lý hoàn tiền theo phương thức thanh toán ban đầu. Sau khi hoàn tiền thành công, hệ thống cập nhật trạng thái đơn hàng thành “Đã hủy” và lưu thông tin hoàn t</w:t>
+      </w:r>
+      <w:r>
+        <w:rPr>
+          <w:rFonts w:ascii="Times New Roman" w:hAnsi="Times New Roman" w:cs="Times New Roman"/>
+          <w:sz w:val="26"/>
+          <w:szCs w:val="26"/>
+        </w:rPr>
+        <w:t>iền.</w:t>
+      </w:r>
+    </w:p>
+    <w:p>
+      <w:pPr>
+        <w:rPr>
+          <w:rFonts w:ascii="Times New Roman" w:hAnsi="Times New Roman" w:cs="Times New Roman"/>
+          <w:sz w:val="26"/>
+          <w:szCs w:val="26"/>
+        </w:rPr>
+      </w:pPr>
+      <w:r>
+        <w:rPr>
+          <w:rFonts w:ascii="Times New Roman" w:hAnsi="Times New Roman" w:cs="Times New Roman"/>
+          <w:sz w:val="26"/>
+          <w:szCs w:val="26"/>
+        </w:rPr>
+        <w:t>– Khi đơn hàng bị hủy, hệ thống cập nhật lại số lượng tồn kho đối với các sản phẩm đã bị trừ tồn trước đó.</w:t>
+      </w:r>
+    </w:p>
+    <w:p>
+      <w:pPr>
+        <w:rPr>
+          <w:rFonts w:ascii="Times New Roman" w:hAnsi="Times New Roman" w:cs="Times New Roman"/>
+          <w:sz w:val="26"/>
+          <w:szCs w:val="26"/>
+        </w:rPr>
+      </w:pPr>
+      <w:r>
+        <w:rPr>
+          <w:rFonts w:ascii="Times New Roman" w:hAnsi="Times New Roman" w:cs="Times New Roman"/>
+          <w:sz w:val="26"/>
+          <w:szCs w:val="26"/>
+        </w:rPr>
+        <w:t>– Nếu đơn hàng đã hoàn tất và không còn thuộc trường hợp được phép hủy, hệ thống thông báo để nhân viên xử lý theo quy định đổi/trả của cửa hàng.</w:t>
+      </w:r>
+    </w:p>
+    <w:p>
+      <w:pPr>
+        <w:rPr>
+          <w:rFonts w:ascii="Times New Roman" w:hAnsi="Times New Roman" w:cs="Times New Roman"/>
+          <w:b/>
+          <w:bCs/>
+          <w:sz w:val="26"/>
+          <w:szCs w:val="26"/>
+          <w:lang w:val="vi-VN"/>
+        </w:rPr>
+      </w:pPr>
+      <w:r>
+        <w:rPr>
+          <w:rFonts w:ascii="Times New Roman" w:hAnsi="Times New Roman" w:cs="Times New Roman"/>
+          <w:b/>
+          <w:bCs/>
+          <w:sz w:val="26"/>
+          <w:szCs w:val="26"/>
+          <w:lang w:val="vi-VN"/>
+        </w:rPr>
+        <w:t>Quy trình nghiệp vụ của chức năng đổi/trả hàng</w:t>
+      </w:r>
+    </w:p>
+    <w:p>
+      <w:pPr>
+        <w:rPr>
+          <w:rFonts w:ascii="Times New Roman" w:hAnsi="Times New Roman" w:cs="Times New Roman"/>
+          <w:sz w:val="26"/>
+          <w:szCs w:val="26"/>
+        </w:rPr>
+      </w:pPr>
+      <w:r>
+        <w:rPr>
+          <w:rFonts w:ascii="Times New Roman" w:hAnsi="Times New Roman" w:cs="Times New Roman"/>
+          <w:sz w:val="26"/>
+          <w:szCs w:val="26"/>
+        </w:rPr>
+        <w:t>– Khi khách hàng có nhu cầu đổi hoặc trả sản phẩm, khách hàng cung cấp thông tin hóa đơn hoặc giao dịch cho Nhân viên bán hàng/Thu ngân tại cửa hàng.</w:t>
+      </w:r>
+    </w:p>
+    <w:p>
+      <w:pPr>
+        <w:rPr>
+          <w:rFonts w:ascii="Times New Roman" w:hAnsi="Times New Roman" w:cs="Times New Roman"/>
+          <w:sz w:val="26"/>
+          <w:szCs w:val="26"/>
+        </w:rPr>
+      </w:pPr>
+      <w:r>
+        <w:rPr>
+          <w:rFonts w:ascii="Times New Roman" w:hAnsi="Times New Roman" w:cs="Times New Roman"/>
+          <w:sz w:val="26"/>
+          <w:szCs w:val="26"/>
+        </w:rPr>
+        <w:t>– Nhân viên tra cứu đơn hàng trên hệ thống, kiểm tra sản phẩm, thời gian mua và điều kiện đổi/trả theo quy định của cửa hàng.</w:t>
+      </w:r>
+    </w:p>
+    <w:p>
+      <w:pPr>
+        <w:rPr>
+          <w:rFonts w:ascii="Times New Roman" w:hAnsi="Times New Roman" w:cs="Times New Roman"/>
+          <w:sz w:val="26"/>
+          <w:szCs w:val="26"/>
+        </w:rPr>
+      </w:pPr>
+      <w:r>
+        <w:rPr>
+          <w:rFonts w:ascii="Times New Roman" w:hAnsi="Times New Roman" w:cs="Times New Roman"/>
+          <w:sz w:val="26"/>
+          <w:szCs w:val="26"/>
+        </w:rPr>
+        <w:t>– Nếu sản phẩm không đáp ứng điều kiện đổi/trả, nhân viên thông báo lý do cho khách hàng và hệ thống không thực hiện thay đổi giao dịch.</w:t>
+      </w:r>
+    </w:p>
+    <w:p>
+      <w:pPr>
+        <w:rPr>
+          <w:rFonts w:ascii="Times New Roman" w:hAnsi="Times New Roman" w:cs="Times New Roman"/>
+          <w:sz w:val="26"/>
+          <w:szCs w:val="26"/>
+        </w:rPr>
+      </w:pPr>
+      <w:r>
+        <w:rPr>
+          <w:rFonts w:ascii="Times New Roman" w:hAnsi="Times New Roman" w:cs="Times New Roman"/>
+          <w:sz w:val="26"/>
+          <w:szCs w:val="26"/>
+        </w:rPr>
+        <w:t>– Nếu sản phẩm đáp ứng điều kiện, nhân viên lựa chọn hình thức xử lý đổi sản phẩm hoặc hoàn tiền. Hệ thống ghi nhận thông tin đổi/trả và cập nhật trạng thái giao dịch.</w:t>
+      </w:r>
+    </w:p>
+    <w:p>
+      <w:pPr>
+        <w:rPr>
+          <w:rFonts w:ascii="Times New Roman" w:hAnsi="Times New Roman" w:cs="Times New Roman"/>
+          <w:sz w:val="26"/>
+          <w:szCs w:val="26"/>
+        </w:rPr>
+      </w:pPr>
+      <w:r>
+        <w:rPr>
+          <w:rFonts w:ascii="Times New Roman" w:hAnsi="Times New Roman" w:cs="Times New Roman"/>
+          <w:sz w:val="26"/>
+          <w:szCs w:val="26"/>
+        </w:rPr>
+        <w:t>– Trường hợp đổi sản phẩm, hệ thống cập nhật lại sản phẩm trong giao dịch và điều chỉnh số lượng tồn kho tương ứng.</w:t>
+      </w:r>
+    </w:p>
+    <w:p>
+      <w:pPr>
+        <w:rPr>
+          <w:rFonts w:ascii="Times New Roman" w:hAnsi="Times New Roman" w:cs="Times New Roman"/>
+          <w:sz w:val="26"/>
+          <w:szCs w:val="26"/>
+        </w:rPr>
+      </w:pPr>
+      <w:r>
+        <w:rPr>
+          <w:rFonts w:ascii="Times New Roman" w:hAnsi="Times New Roman" w:cs="Times New Roman"/>
+          <w:sz w:val="26"/>
+          <w:szCs w:val="26"/>
+        </w:rPr>
+        <w:t>– Trường hợp trả hàng, nếu sản phẩm đủ điều kiện nhập lại kho, hệ thống cập nhật số lượng tồn kho; Thu ngân thực hiện hoàn tiền cho khách hàng và lưu thông tin hoàn tiền.</w:t>
+      </w:r>
+    </w:p>
+    <w:p>
+      <w:pPr>
+        <w:rPr>
+          <w:rFonts w:ascii="Times New Roman" w:hAnsi="Times New Roman" w:cs="Times New Roman"/>
+          <w:b/>
+          <w:bCs/>
+          <w:sz w:val="26"/>
+          <w:szCs w:val="26"/>
+          <w:lang w:val="vi-VN"/>
+        </w:rPr>
+      </w:pPr>
+      <w:r>
+        <w:rPr>
+          <w:rFonts w:ascii="Times New Roman" w:hAnsi="Times New Roman" w:cs="Times New Roman"/>
+          <w:b/>
+          <w:bCs/>
+          <w:sz w:val="26"/>
+          <w:szCs w:val="26"/>
+          <w:lang w:val="vi-VN"/>
+        </w:rPr>
+        <w:t>Quy trình nghiệp vụ của chức năng quản lý tồn kho</w:t>
+      </w:r>
+    </w:p>
+    <w:p>
+      <w:pPr>
+        <w:rPr>
+          <w:rFonts w:ascii="Times New Roman" w:hAnsi="Times New Roman" w:cs="Times New Roman"/>
+          <w:sz w:val="26"/>
+          <w:szCs w:val="26"/>
+          <w:lang w:val="vi-VN"/>
+        </w:rPr>
+      </w:pPr>
+      <w:r>
+        <w:rPr>
+          <w:rFonts w:ascii="Times New Roman" w:hAnsi="Times New Roman" w:cs="Times New Roman"/>
+          <w:sz w:val="26"/>
+          <w:szCs w:val="26"/>
+          <w:lang w:val="vi-VN"/>
         </w:rPr>
         <w:lastRenderedPageBreak/>
-        <w:t>– Sau khi nhận đơn hàng từ Nhân viên bán hàng, Thu ngân kiểm tra thông tin đơn hàng. Hệ thống tính tổng tiền và áp dụng chương trình khuyến mãi hoặc mã giảm giá nếu có.</w:t>
-      </w:r>
-    </w:p>
-    <w:p>
-      <w:pPr>
-        <w:rPr>
-          <w:rFonts w:ascii="Times New Roman" w:hAnsi="Times New Roman" w:cs="Times New Roman"/>
-          <w:sz w:val="26"/>
-          <w:szCs w:val="26"/>
-        </w:rPr>
-      </w:pPr>
-      <w:r>
-        <w:rPr>
-          <w:rFonts w:ascii="Times New Roman" w:hAnsi="Times New Roman" w:cs="Times New Roman"/>
-          <w:sz w:val="26"/>
-          <w:szCs w:val="26"/>
-        </w:rPr>
-        <w:t>– Hệ thống hiển thị số tiền khách hàng cần thanh toán. Thu ngân lựa chọn phương thức thanh toán gồm tiền mặt hoặc chuyển khoản bằng mã QR.</w:t>
-      </w:r>
-    </w:p>
-    <w:p>
-      <w:pPr>
-        <w:rPr>
-          <w:rFonts w:ascii="Times New Roman" w:hAnsi="Times New Roman" w:cs="Times New Roman"/>
-          <w:sz w:val="26"/>
-          <w:szCs w:val="26"/>
-        </w:rPr>
-      </w:pPr>
-      <w:r>
-        <w:rPr>
-          <w:rFonts w:ascii="Times New Roman" w:hAnsi="Times New Roman" w:cs="Times New Roman"/>
-          <w:sz w:val="26"/>
-          <w:szCs w:val="26"/>
-        </w:rPr>
-        <w:t>– Nếu khách hàng thanh toán bằng tiền mặt, Thu ngân nhập số tiền nhận từ khách và hệ thống xác nhận thanh toán sau khi giao dịch hoàn tất.</w:t>
-      </w:r>
-    </w:p>
-    <w:p>
-      <w:pPr>
-        <w:rPr>
-          <w:rFonts w:ascii="Times New Roman" w:hAnsi="Times New Roman" w:cs="Times New Roman"/>
-          <w:sz w:val="26"/>
-          <w:szCs w:val="26"/>
-        </w:rPr>
-      </w:pPr>
-      <w:r>
-        <w:rPr>
-          <w:rFonts w:ascii="Times New Roman" w:hAnsi="Times New Roman" w:cs="Times New Roman"/>
-          <w:sz w:val="26"/>
-          <w:szCs w:val="26"/>
-        </w:rPr>
-        <w:t>– Nếu khách hàng thanh toán bằng chuyển khoản, hệ thống hiển thị hoặc tạo mã QR thanh toán. Sau khi xác nhận đã nhận được khoản thanh toán, Thu ngân xác nhận giao dịch trên hệ thống.</w:t>
-      </w:r>
-    </w:p>
-    <w:p>
-      <w:pPr>
-        <w:rPr>
-          <w:rFonts w:ascii="Times New Roman" w:hAnsi="Times New Roman" w:cs="Times New Roman"/>
-          <w:sz w:val="26"/>
-          <w:szCs w:val="26"/>
-        </w:rPr>
-      </w:pPr>
-      <w:r>
-        <w:rPr>
-          <w:rFonts w:ascii="Times New Roman" w:hAnsi="Times New Roman" w:cs="Times New Roman"/>
-          <w:sz w:val="26"/>
-          <w:szCs w:val="26"/>
-        </w:rPr>
-        <w:t>– Khi thanh toán thành công, hệ thống cập nhật trạng thái đơn hàng thành “Đã thanh toán” hoặc “Hoàn thành”, lưu thông tin thanh toán và cho phép Thu ngân lập, in hóa đơn cho khách hàng.</w:t>
-      </w:r>
-    </w:p>
-    <w:p>
-      <w:pPr>
-        <w:rPr>
-          <w:rFonts w:ascii="Times New Roman" w:hAnsi="Times New Roman" w:cs="Times New Roman"/>
-          <w:sz w:val="26"/>
-          <w:szCs w:val="26"/>
-        </w:rPr>
-      </w:pPr>
-      <w:r>
-        <w:rPr>
-          <w:rFonts w:ascii="Times New Roman" w:hAnsi="Times New Roman" w:cs="Times New Roman"/>
-          <w:sz w:val="26"/>
-          <w:szCs w:val="26"/>
-        </w:rPr>
-        <w:t>– Nếu thanh toán chưa hoàn tất hoặc có lỗi, hệ thống giữ đơn hàng ở trạng thái “Chờ thanh toán” để Thu ngân tiếp tục xử lý.</w:t>
-      </w:r>
-    </w:p>
-    <w:p>
-      <w:pPr>
-        <w:rPr>
-          <w:rFonts w:ascii="Times New Roman" w:hAnsi="Times New Roman" w:cs="Times New Roman"/>
-          <w:b/>
-          <w:bCs/>
+        <w:t xml:space="preserve">– Nhân viên kho chọn chức </w:t>
+      </w:r>
+      <w:r>
+        <w:rPr>
+          <w:rFonts w:ascii="Times New Roman" w:hAnsi="Times New Roman" w:cs="Times New Roman"/>
           <w:sz w:val="26"/>
           <w:szCs w:val="26"/>
           <w:lang w:val="vi-VN"/>
         </w:rPr>
-      </w:pPr>
-      <w:r>
-        <w:rPr>
-          <w:rFonts w:ascii="Times New Roman" w:hAnsi="Times New Roman" w:cs="Times New Roman"/>
-          <w:b/>
-          <w:bCs/>
+        <w:t>năng “Quản lý tồn kho”</w:t>
+      </w:r>
+      <w:r>
+        <w:rPr>
+          <w:rFonts w:ascii="Times New Roman" w:hAnsi="Times New Roman" w:cs="Times New Roman"/>
           <w:sz w:val="26"/>
           <w:szCs w:val="26"/>
           <w:lang w:val="vi-VN"/>
         </w:rPr>
-        <w:t>Quy trình nghiệp vụ của chức năng hủy đơn hàng</w:t>
-      </w:r>
-    </w:p>
-    <w:p>
-      <w:pPr>
-        <w:rPr>
-          <w:rFonts w:ascii="Times New Roman" w:hAnsi="Times New Roman" w:cs="Times New Roman"/>
-          <w:sz w:val="26"/>
-          <w:szCs w:val="26"/>
-        </w:rPr>
-      </w:pPr>
-      <w:r>
-        <w:rPr>
-          <w:rFonts w:ascii="Times New Roman" w:hAnsi="Times New Roman" w:cs="Times New Roman"/>
-          <w:sz w:val="26"/>
-          <w:szCs w:val="26"/>
-        </w:rPr>
-        <w:t xml:space="preserve">– Khi khách hàng yêu cầu hủy đơn tại cửa hàng, </w:t>
-      </w:r>
-      <w:r>
-        <w:rPr>
-          <w:rFonts w:ascii="Times New Roman" w:hAnsi="Times New Roman" w:cs="Times New Roman"/>
-          <w:sz w:val="26"/>
-          <w:szCs w:val="26"/>
-        </w:rPr>
-        <w:t>Nhân viên bán hàng hoặc Thu ngân tìm kiếm và lựa chọn đơn hàng cần hủy trên hệ thống.</w:t>
-      </w:r>
-    </w:p>
-    <w:p>
-      <w:pPr>
-        <w:rPr>
-          <w:rFonts w:ascii="Times New Roman" w:hAnsi="Times New Roman" w:cs="Times New Roman"/>
-          <w:sz w:val="26"/>
-          <w:szCs w:val="26"/>
-        </w:rPr>
-      </w:pPr>
-      <w:r>
-        <w:rPr>
-          <w:rFonts w:ascii="Times New Roman" w:hAnsi="Times New Roman" w:cs="Times New Roman"/>
-          <w:sz w:val="26"/>
-          <w:szCs w:val="26"/>
-        </w:rPr>
-        <w:t>– Hệ thống kiểm tra trạng thái hiện tại của đơn hàng. Nếu đơn hàng đang ở trạng thái “Chờ thanh toán”, nhân viên có thể thực hiện hủy đơn và hệ thống cập nhật trạng thái thành “Đã hủy”.</w:t>
-      </w:r>
-    </w:p>
-    <w:p>
-      <w:pPr>
-        <w:rPr>
-          <w:rFonts w:ascii="Times New Roman" w:hAnsi="Times New Roman" w:cs="Times New Roman"/>
-          <w:sz w:val="26"/>
-          <w:szCs w:val="26"/>
-        </w:rPr>
-      </w:pPr>
-      <w:r>
-        <w:rPr>
-          <w:rFonts w:ascii="Times New Roman" w:hAnsi="Times New Roman" w:cs="Times New Roman"/>
-          <w:sz w:val="26"/>
-          <w:szCs w:val="26"/>
-        </w:rPr>
-        <w:t>– Nếu đơn hàng đã được thanh toán, Thu ngân kiểm tra thông tin giao dịch và thực hiện xử lý hoàn tiền theo phương thức thanh toán ban đầu. Sau khi hoàn tiền thành công, hệ thống cập nhật trạng thái đơn hàng thành “Đã hủy” và lưu thông tin hoàn t</w:t>
-      </w:r>
-      <w:r>
-        <w:rPr>
-          <w:rFonts w:ascii="Times New Roman" w:hAnsi="Times New Roman" w:cs="Times New Roman"/>
-          <w:sz w:val="26"/>
-          <w:szCs w:val="26"/>
-        </w:rPr>
-        <w:t>iền.</w:t>
-      </w:r>
-    </w:p>
-    <w:p>
-      <w:pPr>
-        <w:rPr>
-          <w:rFonts w:ascii="Times New Roman" w:hAnsi="Times New Roman" w:cs="Times New Roman"/>
-          <w:sz w:val="26"/>
-          <w:szCs w:val="26"/>
-        </w:rPr>
-      </w:pPr>
-      <w:r>
-        <w:rPr>
-          <w:rFonts w:ascii="Times New Roman" w:hAnsi="Times New Roman" w:cs="Times New Roman"/>
-          <w:sz w:val="26"/>
-          <w:szCs w:val="26"/>
-        </w:rPr>
-        <w:t>– Khi đơn hàng bị hủy, hệ thống cập nhật lại số lượng tồn kho đối với các sản phẩm đã bị trừ tồn trước đó.</w:t>
-      </w:r>
-    </w:p>
-    <w:p>
-      <w:pPr>
-        <w:rPr>
-          <w:rFonts w:ascii="Times New Roman" w:hAnsi="Times New Roman" w:cs="Times New Roman"/>
-          <w:sz w:val="26"/>
-          <w:szCs w:val="26"/>
-        </w:rPr>
-      </w:pPr>
-      <w:r>
-        <w:rPr>
-          <w:rFonts w:ascii="Times New Roman" w:hAnsi="Times New Roman" w:cs="Times New Roman"/>
-          <w:sz w:val="26"/>
-          <w:szCs w:val="26"/>
-        </w:rPr>
-        <w:t>– Nếu đơn hàng đã hoàn tất và không còn thuộc trường hợp được phép hủy, hệ thống thông báo để nhân viên xử lý theo quy định đổi/trả của cửa hàng.</w:t>
-      </w:r>
-    </w:p>
-    <w:p>
-      <w:pPr>
-        <w:rPr>
-          <w:rFonts w:ascii="Times New Roman" w:hAnsi="Times New Roman" w:cs="Times New Roman"/>
-          <w:b/>
-          <w:bCs/>
+        <w:t xml:space="preserve"> để kiểm tra số lượng sản phẩm đang tồn trong hệ thống. Nếu không có sản phẩm cần kiểm kê, nhân viên tiếp tục theo dõi tồn kho.</w:t>
+      </w:r>
+    </w:p>
+    <w:p>
+      <w:pPr>
+        <w:rPr>
+          <w:rFonts w:ascii="Times New Roman" w:hAnsi="Times New Roman" w:cs="Times New Roman"/>
           <w:sz w:val="26"/>
           <w:szCs w:val="26"/>
           <w:lang w:val="vi-VN"/>
@@ -3007,81 +3191,284 @@
       <w:r>
         <w:rPr>
           <w:rFonts w:ascii="Times New Roman" w:hAnsi="Times New Roman" w:cs="Times New Roman"/>
-          <w:b/>
-          <w:bCs/>
           <w:sz w:val="26"/>
           <w:szCs w:val="26"/>
           <w:lang w:val="vi-VN"/>
         </w:rPr>
-        <w:t>Quy trình nghiệp vụ của chức năng đổi/trả hàng</w:t>
-      </w:r>
-    </w:p>
-    <w:p>
-      <w:pPr>
-        <w:rPr>
-          <w:rFonts w:ascii="Times New Roman" w:hAnsi="Times New Roman" w:cs="Times New Roman"/>
-          <w:sz w:val="26"/>
-          <w:szCs w:val="26"/>
-        </w:rPr>
-      </w:pPr>
-      <w:r>
-        <w:rPr>
-          <w:rFonts w:ascii="Times New Roman" w:hAnsi="Times New Roman" w:cs="Times New Roman"/>
-          <w:sz w:val="26"/>
-          <w:szCs w:val="26"/>
-        </w:rPr>
-        <w:t>– Khi khách hàng có nhu cầu đổi hoặc trả sản phẩm, khách hàng cung cấp thông tin hóa đơn hoặc giao dịch cho Nhân viên bán hàng/Thu ngân tại cửa hàng.</w:t>
-      </w:r>
-    </w:p>
-    <w:p>
-      <w:pPr>
-        <w:rPr>
-          <w:rFonts w:ascii="Times New Roman" w:hAnsi="Times New Roman" w:cs="Times New Roman"/>
-          <w:sz w:val="26"/>
-          <w:szCs w:val="26"/>
-        </w:rPr>
-      </w:pPr>
-      <w:r>
-        <w:rPr>
-          <w:rFonts w:ascii="Times New Roman" w:hAnsi="Times New Roman" w:cs="Times New Roman"/>
-          <w:sz w:val="26"/>
-          <w:szCs w:val="26"/>
-        </w:rPr>
-        <w:t>– Nhân viên tra cứu đơn hàng trên hệ thống, kiểm tra sản phẩm, thời gian mua và điều kiện đổi/trả theo quy định của cửa hàng.</w:t>
-      </w:r>
-    </w:p>
-    <w:p>
-      <w:pPr>
-        <w:rPr>
-          <w:rFonts w:ascii="Times New Roman" w:hAnsi="Times New Roman" w:cs="Times New Roman"/>
-          <w:sz w:val="26"/>
-          <w:szCs w:val="26"/>
-        </w:rPr>
-      </w:pPr>
-      <w:r>
-        <w:rPr>
-          <w:rFonts w:ascii="Times New Roman" w:hAnsi="Times New Roman" w:cs="Times New Roman"/>
-          <w:sz w:val="26"/>
-          <w:szCs w:val="26"/>
-        </w:rPr>
-        <w:t>– Nếu sản phẩm không đáp ứng điều kiện đổi/trả, nhân viên thông báo lý do cho khách hàng và hệ thống không thực hiện thay đổi giao dịch.</w:t>
-      </w:r>
-    </w:p>
-    <w:p>
-      <w:pPr>
-        <w:rPr>
-          <w:rFonts w:ascii="Times New Roman" w:hAnsi="Times New Roman" w:cs="Times New Roman"/>
-          <w:sz w:val="26"/>
-          <w:szCs w:val="26"/>
-        </w:rPr>
-      </w:pPr>
-      <w:r>
-        <w:rPr>
-          <w:rFonts w:ascii="Times New Roman" w:hAnsi="Times New Roman" w:cs="Times New Roman"/>
-          <w:sz w:val="26"/>
-          <w:szCs w:val="26"/>
-        </w:rPr>
-        <w:t>– Nếu sản phẩm đáp ứng điều kiện, nhân viên lựa chọn hình thức xử lý đổi sản phẩm hoặc hoàn tiền. Hệ thống ghi nhận thông tin đổi/trả và cập nhật trạng thái giao dịch.</w:t>
+        <w:t>– Nếu cần kiểm kê, nhân viên kiểm tra số lượng thực tế và so sánh với số liệu trên hệ thống. Nếu số liệu không có chênh lệch, nhân viên xác nhận số liệu tồn kho.</w:t>
+      </w:r>
+    </w:p>
+    <w:p>
+      <w:pPr>
+        <w:rPr>
+          <w:rFonts w:ascii="Times New Roman" w:hAnsi="Times New Roman" w:cs="Times New Roman"/>
+          <w:sz w:val="26"/>
+          <w:szCs w:val="26"/>
+          <w:lang w:val="vi-VN"/>
+        </w:rPr>
+      </w:pPr>
+      <w:r>
+        <w:rPr>
+          <w:rFonts w:ascii="Times New Roman" w:hAnsi="Times New Roman" w:cs="Times New Roman"/>
+          <w:sz w:val="26"/>
+          <w:szCs w:val="26"/>
+          <w:lang w:val="vi-VN"/>
+        </w:rPr>
+        <w:t>– Nếu có chênh lệch, nhân viên thực hiện điều chỉnh số lượng tồn kho và hệ thống lưu lại lịch sử điều chỉnh.</w:t>
+      </w:r>
+    </w:p>
+    <w:p>
+      <w:pPr>
+        <w:rPr>
+          <w:rFonts w:ascii="Times New Roman" w:hAnsi="Times New Roman" w:cs="Times New Roman"/>
+          <w:sz w:val="26"/>
+          <w:szCs w:val="26"/>
+          <w:lang w:val="vi-VN"/>
+        </w:rPr>
+      </w:pPr>
+      <w:r>
+        <w:rPr>
+          <w:rFonts w:ascii="Times New Roman" w:hAnsi="Times New Roman" w:cs="Times New Roman"/>
+          <w:sz w:val="26"/>
+          <w:szCs w:val="26"/>
+          <w:lang w:val="vi-VN"/>
+        </w:rPr>
+        <w:t>– Tồn kho được cập nhật dựa trên các nghiệp vụ: nhập hàng làm tăng tồn kho; đơn hàng được xác nhận làm giảm tồn kho; hàng trả lại đạt điều kiện làm tăng tồn kho; đơn hàng bị hủy sẽ hoàn lại tồn kho nếu trước đó sản phẩm đã được trừ tồn.</w:t>
+      </w:r>
+    </w:p>
+    <w:p>
+      <w:pPr>
+        <w:rPr>
+          <w:rFonts w:ascii="Times New Roman" w:hAnsi="Times New Roman" w:cs="Times New Roman"/>
+          <w:b/>
+          <w:bCs/>
+          <w:sz w:val="26"/>
+          <w:szCs w:val="26"/>
+          <w:lang w:val="vi-VN"/>
+        </w:rPr>
+      </w:pPr>
+      <w:r>
+        <w:rPr>
+          <w:rFonts w:ascii="Times New Roman" w:hAnsi="Times New Roman" w:cs="Times New Roman"/>
+          <w:b/>
+          <w:bCs/>
+          <w:sz w:val="26"/>
+          <w:szCs w:val="26"/>
+          <w:lang w:val="vi-VN"/>
+        </w:rPr>
+        <w:t>Quy trình nghiệp vụ của chức năng đặt lịch chăm sóc thú cưng</w:t>
+      </w:r>
+    </w:p>
+    <w:p>
+      <w:pPr>
+        <w:rPr>
+          <w:rFonts w:ascii="Times New Roman" w:hAnsi="Times New Roman" w:cs="Times New Roman"/>
+          <w:sz w:val="26"/>
+          <w:szCs w:val="26"/>
+        </w:rPr>
+      </w:pPr>
+      <w:r>
+        <w:rPr>
+          <w:rFonts w:ascii="Times New Roman" w:hAnsi="Times New Roman" w:cs="Times New Roman"/>
+          <w:sz w:val="26"/>
+          <w:szCs w:val="26"/>
+        </w:rPr>
+        <w:t>– Khi khách hàng có nhu cầu sử dụng dịch vụ chăm sóc thú cưng, Nhân viên bán hàng hoặc Nhân viên chăm sóc tiếp nhận yêu cầu và tra cứu thông tin khách hàng, hồ sơ thú cưng trên hệ thống. Nếu khách hàng hoặc thú cưng chưa có thông tin, nhân viên thực hiện thêm mới.</w:t>
+      </w:r>
+    </w:p>
+    <w:p>
+      <w:pPr>
+        <w:rPr>
+          <w:rFonts w:ascii="Times New Roman" w:hAnsi="Times New Roman" w:cs="Times New Roman"/>
+          <w:sz w:val="26"/>
+          <w:szCs w:val="26"/>
+        </w:rPr>
+      </w:pPr>
+      <w:r>
+        <w:rPr>
+          <w:rFonts w:ascii="Times New Roman" w:hAnsi="Times New Roman" w:cs="Times New Roman"/>
+          <w:sz w:val="26"/>
+          <w:szCs w:val="26"/>
+        </w:rPr>
+        <w:t>– Nhân viên lựa chọn dịch vụ chăm sóc phù hợp như tắm, cắt tỉa lông, cắt móng, vệ sinh hoặc các dịch vụ khác; sau đó chọn nhân viên phụ trách, ngày và giờ thực hiện dịch vụ.</w:t>
+      </w:r>
+    </w:p>
+    <w:p>
+      <w:pPr>
+        <w:rPr>
+          <w:rFonts w:ascii="Times New Roman" w:hAnsi="Times New Roman" w:cs="Times New Roman"/>
+          <w:sz w:val="26"/>
+          <w:szCs w:val="26"/>
+        </w:rPr>
+      </w:pPr>
+      <w:r>
+        <w:rPr>
+          <w:rFonts w:ascii="Times New Roman" w:hAnsi="Times New Roman" w:cs="Times New Roman"/>
+          <w:sz w:val="26"/>
+          <w:szCs w:val="26"/>
+        </w:rPr>
+        <w:t>– Hệ thống kiểm tra lịch làm việc và tình trạng lịch hẹn của nhân viên chăm sóc. Nếu thời gian đã có lịch, hệ thống thông báo để nhân viên chọn khung giờ khác.</w:t>
+      </w:r>
+    </w:p>
+    <w:p>
+      <w:pPr>
+        <w:rPr>
+          <w:rFonts w:ascii="Times New Roman" w:hAnsi="Times New Roman" w:cs="Times New Roman"/>
+          <w:sz w:val="26"/>
+          <w:szCs w:val="26"/>
+        </w:rPr>
+      </w:pPr>
+      <w:r>
+        <w:rPr>
+          <w:rFonts w:ascii="Times New Roman" w:hAnsi="Times New Roman" w:cs="Times New Roman"/>
+          <w:sz w:val="26"/>
+          <w:szCs w:val="26"/>
+        </w:rPr>
+        <w:t>– Nếu thời gian còn trống, hệ thống tạo lịch hẹn, lưu thông tin khách hàng, thú cưng, dịch vụ, nhân viên phụ trách và thời gian thực hiện; đồng thời cập nhật trạng thái lịch hẹn thành “Đã đặt” hoặc “Chờ thực hiện”.</w:t>
+      </w:r>
+    </w:p>
+    <w:p>
+      <w:pPr>
+        <w:rPr>
+          <w:rFonts w:ascii="Times New Roman" w:hAnsi="Times New Roman" w:cs="Times New Roman"/>
+          <w:sz w:val="26"/>
+          <w:szCs w:val="26"/>
+        </w:rPr>
+      </w:pPr>
+      <w:r>
+        <w:rPr>
+          <w:rFonts w:ascii="Times New Roman" w:hAnsi="Times New Roman" w:cs="Times New Roman"/>
+          <w:sz w:val="26"/>
+          <w:szCs w:val="26"/>
+        </w:rPr>
+        <w:t>– Khi đến lịch, Nhân viên chăm sóc tiếp nhận thú cưng và cập nhật trạng thái dịch vụ theo quá trình thực hiện như “Đang thực hiện” và “Đã hoàn thành”.</w:t>
+      </w:r>
+    </w:p>
+    <w:p>
+      <w:pPr>
+        <w:rPr>
+          <w:rFonts w:ascii="Times New Roman" w:hAnsi="Times New Roman" w:cs="Times New Roman"/>
+          <w:sz w:val="26"/>
+          <w:szCs w:val="26"/>
+        </w:rPr>
+      </w:pPr>
+      <w:r>
+        <w:rPr>
+          <w:rFonts w:ascii="Times New Roman" w:hAnsi="Times New Roman" w:cs="Times New Roman"/>
+          <w:sz w:val="26"/>
+          <w:szCs w:val="26"/>
+        </w:rPr>
+        <w:t>– Sau khi dịch vụ hoàn thành, thông tin dịch vụ được lưu vào lịch sử chăm sóc của thú cưng và chuyển thông tin sang Thu ngân để thực hiện thanh toán.</w:t>
+      </w:r>
+    </w:p>
+    <w:p>
+      <w:pPr>
+        <w:rPr>
+          <w:rFonts w:ascii="Times New Roman" w:hAnsi="Times New Roman" w:cs="Times New Roman"/>
+          <w:b/>
+          <w:bCs/>
+          <w:sz w:val="26"/>
+          <w:szCs w:val="26"/>
+          <w:lang w:val="vi-VN"/>
+        </w:rPr>
+      </w:pPr>
+      <w:r>
+        <w:rPr>
+          <w:rFonts w:ascii="Times New Roman" w:hAnsi="Times New Roman" w:cs="Times New Roman"/>
+          <w:b/>
+          <w:bCs/>
+          <w:sz w:val="26"/>
+          <w:szCs w:val="26"/>
+          <w:lang w:val="vi-VN"/>
+        </w:rPr>
+        <w:t>Quy trình nghiệp vụ của chức năng quản lý khuyến mãi</w:t>
+      </w:r>
+    </w:p>
+    <w:p>
+      <w:pPr>
+        <w:rPr>
+          <w:rFonts w:ascii="Times New Roman" w:hAnsi="Times New Roman" w:cs="Times New Roman"/>
+          <w:sz w:val="26"/>
+          <w:szCs w:val="26"/>
+          <w:lang w:val="vi-VN"/>
+        </w:rPr>
+      </w:pPr>
+      <w:r>
+        <w:rPr>
+          <w:rFonts w:ascii="Times New Roman" w:hAnsi="Times New Roman" w:cs="Times New Roman"/>
+          <w:sz w:val="26"/>
+          <w:szCs w:val="26"/>
+          <w:lang w:val="vi-VN"/>
+        </w:rPr>
+        <w:t>– Admin tạo chương trình khuyến mãi và thiết lập các điều kiện áp dụng, mã giảm giá hoặc mức giảm cùng thời gian áp dụng. Sau đó chương trình được lưu vào hệ thống.</w:t>
+      </w:r>
+    </w:p>
+    <w:p>
+      <w:pPr>
+        <w:rPr>
+          <w:rFonts w:ascii="Times New Roman" w:hAnsi="Times New Roman" w:cs="Times New Roman"/>
+          <w:sz w:val="26"/>
+          <w:szCs w:val="26"/>
+        </w:rPr>
+      </w:pPr>
+      <w:r>
+        <w:rPr>
+          <w:rFonts w:ascii="Times New Roman" w:hAnsi="Times New Roman" w:cs="Times New Roman"/>
+          <w:sz w:val="26"/>
+          <w:szCs w:val="26"/>
+          <w:lang w:val="vi-VN"/>
+        </w:rPr>
+        <w:t xml:space="preserve">– </w:t>
+      </w:r>
+      <w:r>
+        <w:rPr>
+          <w:rFonts w:ascii="Times New Roman" w:hAnsi="Times New Roman" w:cs="Times New Roman"/>
+          <w:sz w:val="26"/>
+          <w:szCs w:val="26"/>
+        </w:rPr>
+        <w:t>Khi thực hiện thanh toán, Thu ngân nhập hoặc lựa chọn mã giảm giá. Hệ thống kiểm tra tính hợp lệ, thời gian hiệu lực và điều kiện áp dụng. Nếu hợp lệ, hệ thống áp dụng mức giảm và tính lại tổng tiền đơn hàng.</w:t>
+      </w:r>
+    </w:p>
+    <w:p>
+      <w:pPr>
+        <w:rPr>
+          <w:rFonts w:ascii="Times New Roman" w:hAnsi="Times New Roman" w:cs="Times New Roman"/>
+          <w:sz w:val="26"/>
+          <w:szCs w:val="26"/>
+          <w:lang w:val="vi-VN"/>
+        </w:rPr>
+      </w:pPr>
+      <w:r>
+        <w:rPr>
+          <w:rFonts w:ascii="Times New Roman" w:hAnsi="Times New Roman" w:cs="Times New Roman"/>
+          <w:sz w:val="26"/>
+          <w:szCs w:val="26"/>
+          <w:lang w:val="vi-VN"/>
+        </w:rPr>
+        <w:t>– Nếu mã giảm giá hợp lệ, hệ thống áp dụng mức giảm theo điều kiện của chương trình và tính lại tổng tiền đơn hàng.</w:t>
+      </w:r>
+    </w:p>
+    <w:p>
+      <w:pPr>
+        <w:rPr>
+          <w:rFonts w:ascii="Times New Roman" w:hAnsi="Times New Roman" w:cs="Times New Roman"/>
+          <w:b/>
+          <w:bCs/>
+          <w:sz w:val="26"/>
+          <w:szCs w:val="26"/>
+          <w:lang w:val="vi-VN"/>
+        </w:rPr>
+      </w:pPr>
+      <w:r>
+        <w:rPr>
+          <w:rFonts w:ascii="Times New Roman" w:hAnsi="Times New Roman" w:cs="Times New Roman"/>
+          <w:b/>
+          <w:bCs/>
+          <w:sz w:val="26"/>
+          <w:szCs w:val="26"/>
+          <w:lang w:val="vi-VN"/>
+        </w:rPr>
+        <w:t>Quy trình nghiệp vụ của chức năng chăm sóc và thông báo khách hàng</w:t>
       </w:r>
     </w:p>
     <w:p>
@@ -3099,393 +3486,6 @@
           <w:szCs w:val="26"/>
         </w:rPr>
         <w:lastRenderedPageBreak/>
-        <w:t>– Trường hợp đổi sản phẩm, hệ thống cập nhật lại sản phẩm trong giao dịch và điều chỉnh số lượng tồn kho tương ứng.</w:t>
-      </w:r>
-    </w:p>
-    <w:p>
-      <w:pPr>
-        <w:rPr>
-          <w:rFonts w:ascii="Times New Roman" w:hAnsi="Times New Roman" w:cs="Times New Roman"/>
-          <w:sz w:val="26"/>
-          <w:szCs w:val="26"/>
-        </w:rPr>
-      </w:pPr>
-      <w:r>
-        <w:rPr>
-          <w:rFonts w:ascii="Times New Roman" w:hAnsi="Times New Roman" w:cs="Times New Roman"/>
-          <w:sz w:val="26"/>
-          <w:szCs w:val="26"/>
-        </w:rPr>
-        <w:t>– Trường hợp trả hàng, nếu sản phẩm đủ điều kiện nhập lại kho, hệ thống cập nhật số lượng tồn kho; Thu ngân thực hiện hoàn tiền cho khách hàng và lưu thông tin hoàn tiền.</w:t>
-      </w:r>
-    </w:p>
-    <w:p>
-      <w:pPr>
-        <w:rPr>
-          <w:rFonts w:ascii="Times New Roman" w:hAnsi="Times New Roman" w:cs="Times New Roman"/>
-          <w:b/>
-          <w:bCs/>
-          <w:sz w:val="26"/>
-          <w:szCs w:val="26"/>
-          <w:lang w:val="vi-VN"/>
-        </w:rPr>
-      </w:pPr>
-      <w:r>
-        <w:rPr>
-          <w:rFonts w:ascii="Times New Roman" w:hAnsi="Times New Roman" w:cs="Times New Roman"/>
-          <w:b/>
-          <w:bCs/>
-          <w:sz w:val="26"/>
-          <w:szCs w:val="26"/>
-          <w:lang w:val="vi-VN"/>
-        </w:rPr>
-        <w:t>Quy trình nghiệp vụ của chức năng quản lý tồn kho</w:t>
-      </w:r>
-    </w:p>
-    <w:p>
-      <w:pPr>
-        <w:rPr>
-          <w:rFonts w:ascii="Times New Roman" w:hAnsi="Times New Roman" w:cs="Times New Roman"/>
-          <w:sz w:val="26"/>
-          <w:szCs w:val="26"/>
-          <w:lang w:val="vi-VN"/>
-        </w:rPr>
-      </w:pPr>
-      <w:r>
-        <w:rPr>
-          <w:rFonts w:ascii="Times New Roman" w:hAnsi="Times New Roman" w:cs="Times New Roman"/>
-          <w:sz w:val="26"/>
-          <w:szCs w:val="26"/>
-          <w:lang w:val="vi-VN"/>
-        </w:rPr>
-        <w:t xml:space="preserve">– Nhân viên kho chọn chức </w:t>
-      </w:r>
-      <w:r>
-        <w:rPr>
-          <w:rFonts w:ascii="Times New Roman" w:hAnsi="Times New Roman" w:cs="Times New Roman"/>
-          <w:sz w:val="26"/>
-          <w:szCs w:val="26"/>
-          <w:lang w:val="vi-VN"/>
-        </w:rPr>
-        <w:t>năng “Quản lý tồn kho”</w:t>
-      </w:r>
-      <w:r>
-        <w:rPr>
-          <w:rFonts w:ascii="Times New Roman" w:hAnsi="Times New Roman" w:cs="Times New Roman"/>
-          <w:sz w:val="26"/>
-          <w:szCs w:val="26"/>
-          <w:lang w:val="vi-VN"/>
-        </w:rPr>
-        <w:t xml:space="preserve"> để kiểm tra số lượng sản phẩm đang tồn trong hệ thống. Nếu không có sản phẩm cần kiểm kê, nhân viên tiếp tục theo dõi tồn kho.</w:t>
-      </w:r>
-    </w:p>
-    <w:p>
-      <w:pPr>
-        <w:rPr>
-          <w:rFonts w:ascii="Times New Roman" w:hAnsi="Times New Roman" w:cs="Times New Roman"/>
-          <w:sz w:val="26"/>
-          <w:szCs w:val="26"/>
-          <w:lang w:val="vi-VN"/>
-        </w:rPr>
-      </w:pPr>
-      <w:r>
-        <w:rPr>
-          <w:rFonts w:ascii="Times New Roman" w:hAnsi="Times New Roman" w:cs="Times New Roman"/>
-          <w:sz w:val="26"/>
-          <w:szCs w:val="26"/>
-          <w:lang w:val="vi-VN"/>
-        </w:rPr>
-        <w:t>– Nếu cần kiểm kê, nhân viên kiểm tra số lượng thực tế và so sánh với số liệu trên hệ thống. Nếu số liệu không có chênh lệch, nhân viên xác nhận số liệu tồn kho.</w:t>
-      </w:r>
-    </w:p>
-    <w:p>
-      <w:pPr>
-        <w:rPr>
-          <w:rFonts w:ascii="Times New Roman" w:hAnsi="Times New Roman" w:cs="Times New Roman"/>
-          <w:sz w:val="26"/>
-          <w:szCs w:val="26"/>
-          <w:lang w:val="vi-VN"/>
-        </w:rPr>
-      </w:pPr>
-      <w:r>
-        <w:rPr>
-          <w:rFonts w:ascii="Times New Roman" w:hAnsi="Times New Roman" w:cs="Times New Roman"/>
-          <w:sz w:val="26"/>
-          <w:szCs w:val="26"/>
-          <w:lang w:val="vi-VN"/>
-        </w:rPr>
-        <w:t>– Nếu có chênh lệch, nhân viên thực hiện điều chỉnh số lượng tồn kho và hệ thống lưu lại lịch sử điều chỉnh.</w:t>
-      </w:r>
-    </w:p>
-    <w:p>
-      <w:pPr>
-        <w:rPr>
-          <w:rFonts w:ascii="Times New Roman" w:hAnsi="Times New Roman" w:cs="Times New Roman"/>
-          <w:sz w:val="26"/>
-          <w:szCs w:val="26"/>
-          <w:lang w:val="vi-VN"/>
-        </w:rPr>
-      </w:pPr>
-      <w:r>
-        <w:rPr>
-          <w:rFonts w:ascii="Times New Roman" w:hAnsi="Times New Roman" w:cs="Times New Roman"/>
-          <w:sz w:val="26"/>
-          <w:szCs w:val="26"/>
-          <w:lang w:val="vi-VN"/>
-        </w:rPr>
-        <w:t>– Tồn kho được cập nhật dựa trên các nghiệp vụ: nhập hàng làm tăng tồn kho; đơn hàng được xác nhận làm giảm tồn kho; hàng trả lại đạt điều kiện làm tăng tồn kho; đơn hàng bị hủy sẽ hoàn lại tồn kho nếu trước đó sản phẩm đã được trừ tồn.</w:t>
-      </w:r>
-    </w:p>
-    <w:p>
-      <w:pPr>
-        <w:rPr>
-          <w:rFonts w:ascii="Times New Roman" w:hAnsi="Times New Roman" w:cs="Times New Roman"/>
-          <w:b/>
-          <w:bCs/>
-          <w:sz w:val="26"/>
-          <w:szCs w:val="26"/>
-          <w:lang w:val="vi-VN"/>
-        </w:rPr>
-      </w:pPr>
-      <w:r>
-        <w:rPr>
-          <w:rFonts w:ascii="Times New Roman" w:hAnsi="Times New Roman" w:cs="Times New Roman"/>
-          <w:b/>
-          <w:bCs/>
-          <w:sz w:val="26"/>
-          <w:szCs w:val="26"/>
-          <w:lang w:val="vi-VN"/>
-        </w:rPr>
-        <w:t>Quy trình nghiệp vụ của chức năng đặt lịch chăm sóc thú cưng</w:t>
-      </w:r>
-    </w:p>
-    <w:p>
-      <w:pPr>
-        <w:rPr>
-          <w:rFonts w:ascii="Times New Roman" w:hAnsi="Times New Roman" w:cs="Times New Roman"/>
-          <w:sz w:val="26"/>
-          <w:szCs w:val="26"/>
-        </w:rPr>
-      </w:pPr>
-      <w:r>
-        <w:rPr>
-          <w:rFonts w:ascii="Times New Roman" w:hAnsi="Times New Roman" w:cs="Times New Roman"/>
-          <w:sz w:val="26"/>
-          <w:szCs w:val="26"/>
-        </w:rPr>
-        <w:t>– Khi khách hàng có nhu cầu sử dụng dịch vụ chăm sóc thú cưng, Nhân viên bán hàng hoặc Nhân viên chăm sóc tiếp nhận yêu cầu và tra cứu thông tin khách hàng, hồ sơ thú cưng trên hệ thống. Nếu khách hàng hoặc thú cưng chưa có thông tin, nhân viên thực hiện thêm mới.</w:t>
-      </w:r>
-    </w:p>
-    <w:p>
-      <w:pPr>
-        <w:rPr>
-          <w:rFonts w:ascii="Times New Roman" w:hAnsi="Times New Roman" w:cs="Times New Roman"/>
-          <w:sz w:val="26"/>
-          <w:szCs w:val="26"/>
-        </w:rPr>
-      </w:pPr>
-      <w:r>
-        <w:rPr>
-          <w:rFonts w:ascii="Times New Roman" w:hAnsi="Times New Roman" w:cs="Times New Roman"/>
-          <w:sz w:val="26"/>
-          <w:szCs w:val="26"/>
-        </w:rPr>
-        <w:t>– Nhân viên lựa chọn dịch vụ chăm sóc phù hợp như tắm, cắt tỉa lông, cắt móng, vệ sinh hoặc các dịch vụ khác; sau đó chọn nhân viên phụ trách, ngày và giờ thực hiện dịch vụ.</w:t>
-      </w:r>
-    </w:p>
-    <w:p>
-      <w:pPr>
-        <w:rPr>
-          <w:rFonts w:ascii="Times New Roman" w:hAnsi="Times New Roman" w:cs="Times New Roman"/>
-          <w:sz w:val="26"/>
-          <w:szCs w:val="26"/>
-        </w:rPr>
-      </w:pPr>
-      <w:r>
-        <w:rPr>
-          <w:rFonts w:ascii="Times New Roman" w:hAnsi="Times New Roman" w:cs="Times New Roman"/>
-          <w:sz w:val="26"/>
-          <w:szCs w:val="26"/>
-        </w:rPr>
-        <w:t>– Hệ thống kiểm tra lịch làm việc và tình trạng lịch hẹn của nhân viên chăm sóc. Nếu thời gian đã có lịch, hệ thống thông báo để nhân viên chọn khung giờ khác.</w:t>
-      </w:r>
-    </w:p>
-    <w:p>
-      <w:pPr>
-        <w:rPr>
-          <w:rFonts w:ascii="Times New Roman" w:hAnsi="Times New Roman" w:cs="Times New Roman"/>
-          <w:sz w:val="26"/>
-          <w:szCs w:val="26"/>
-        </w:rPr>
-      </w:pPr>
-      <w:r>
-        <w:rPr>
-          <w:rFonts w:ascii="Times New Roman" w:hAnsi="Times New Roman" w:cs="Times New Roman"/>
-          <w:sz w:val="26"/>
-          <w:szCs w:val="26"/>
-        </w:rPr>
-        <w:t>– Nếu thời gian còn trống, hệ thống tạo lịch hẹn, lưu thông tin khách hàng, thú cưng, dịch vụ, nhân viên phụ trách và thời gian thực hiện; đồng thời cập nhật trạng thái lịch hẹn thành “Đã đặt” hoặc “Chờ thực hiện”.</w:t>
-      </w:r>
-    </w:p>
-    <w:p>
-      <w:pPr>
-        <w:rPr>
-          <w:rFonts w:ascii="Times New Roman" w:hAnsi="Times New Roman" w:cs="Times New Roman"/>
-          <w:sz w:val="26"/>
-          <w:szCs w:val="26"/>
-        </w:rPr>
-      </w:pPr>
-      <w:r>
-        <w:rPr>
-          <w:rFonts w:ascii="Times New Roman" w:hAnsi="Times New Roman" w:cs="Times New Roman"/>
-          <w:sz w:val="26"/>
-          <w:szCs w:val="26"/>
-        </w:rPr>
-        <w:t>– Khi đến lịch, Nhân viên chăm sóc tiếp nhận thú cưng và cập nhật trạng thái dịch vụ theo quá trình thực hiện như “Đang thực hiện” và “Đã hoàn thành”.</w:t>
-      </w:r>
-    </w:p>
-    <w:p>
-      <w:pPr>
-        <w:rPr>
-          <w:rFonts w:ascii="Times New Roman" w:hAnsi="Times New Roman" w:cs="Times New Roman"/>
-          <w:sz w:val="26"/>
-          <w:szCs w:val="26"/>
-        </w:rPr>
-      </w:pPr>
-      <w:r>
-        <w:rPr>
-          <w:rFonts w:ascii="Times New Roman" w:hAnsi="Times New Roman" w:cs="Times New Roman"/>
-          <w:sz w:val="26"/>
-          <w:szCs w:val="26"/>
-        </w:rPr>
-        <w:t>– Sau khi dịch vụ hoàn thành, thông tin dịch vụ được lưu vào lịch sử chăm sóc của thú cưng và chuyển thông tin sang Thu ngân để thực hiện thanh toán.</w:t>
-      </w:r>
-    </w:p>
-    <w:p>
-      <w:pPr>
-        <w:rPr>
-          <w:rFonts w:ascii="Times New Roman" w:hAnsi="Times New Roman" w:cs="Times New Roman"/>
-          <w:b/>
-          <w:bCs/>
-          <w:sz w:val="26"/>
-          <w:szCs w:val="26"/>
-          <w:lang w:val="vi-VN"/>
-        </w:rPr>
-      </w:pPr>
-      <w:r>
-        <w:rPr>
-          <w:rFonts w:ascii="Times New Roman" w:hAnsi="Times New Roman" w:cs="Times New Roman"/>
-          <w:b/>
-          <w:bCs/>
-          <w:sz w:val="26"/>
-          <w:szCs w:val="26"/>
-          <w:lang w:val="vi-VN"/>
-        </w:rPr>
-        <w:t>Quy trình nghiệp vụ của chức năng quản lý khuyến mãi</w:t>
-      </w:r>
-    </w:p>
-    <w:p>
-      <w:pPr>
-        <w:rPr>
-          <w:rFonts w:ascii="Times New Roman" w:hAnsi="Times New Roman" w:cs="Times New Roman"/>
-          <w:sz w:val="26"/>
-          <w:szCs w:val="26"/>
-          <w:lang w:val="vi-VN"/>
-        </w:rPr>
-      </w:pPr>
-      <w:r>
-        <w:rPr>
-          <w:rFonts w:ascii="Times New Roman" w:hAnsi="Times New Roman" w:cs="Times New Roman"/>
-          <w:sz w:val="26"/>
-          <w:szCs w:val="26"/>
-          <w:lang w:val="vi-VN"/>
-        </w:rPr>
-        <w:t>– Admin tạo chương trình khuyến mãi và thiết lập các điều kiện áp dụng, mã giảm giá hoặc mức giảm cùng thời gian áp dụng. Sau đó chương trình được lưu vào hệ thống.</w:t>
-      </w:r>
-    </w:p>
-    <w:p>
-      <w:pPr>
-        <w:rPr>
-          <w:rFonts w:ascii="Times New Roman" w:hAnsi="Times New Roman" w:cs="Times New Roman"/>
-          <w:sz w:val="26"/>
-          <w:szCs w:val="26"/>
-        </w:rPr>
-      </w:pPr>
-      <w:r>
-        <w:rPr>
-          <w:rFonts w:ascii="Times New Roman" w:hAnsi="Times New Roman" w:cs="Times New Roman"/>
-          <w:sz w:val="26"/>
-          <w:szCs w:val="26"/>
-          <w:lang w:val="vi-VN"/>
-        </w:rPr>
-        <w:lastRenderedPageBreak/>
-        <w:t xml:space="preserve">– </w:t>
-      </w:r>
-      <w:r>
-        <w:rPr>
-          <w:rFonts w:ascii="Times New Roman" w:hAnsi="Times New Roman" w:cs="Times New Roman"/>
-          <w:sz w:val="26"/>
-          <w:szCs w:val="26"/>
-        </w:rPr>
-        <w:t>Khi thực hiện thanh toán, Thu ngân nhập hoặc lựa chọn mã giảm giá. Hệ thống kiểm tra tính hợp lệ, thời gian hiệu lực và điều kiện áp dụng. Nếu hợp lệ, hệ thống áp dụng mức giảm và tính lại tổng tiền đơn hàng.</w:t>
-      </w:r>
-    </w:p>
-    <w:p>
-      <w:pPr>
-        <w:rPr>
-          <w:rFonts w:ascii="Times New Roman" w:hAnsi="Times New Roman" w:cs="Times New Roman"/>
-          <w:sz w:val="26"/>
-          <w:szCs w:val="26"/>
-          <w:lang w:val="vi-VN"/>
-        </w:rPr>
-      </w:pPr>
-      <w:r>
-        <w:rPr>
-          <w:rFonts w:ascii="Times New Roman" w:hAnsi="Times New Roman" w:cs="Times New Roman"/>
-          <w:sz w:val="26"/>
-          <w:szCs w:val="26"/>
-          <w:lang w:val="vi-VN"/>
-        </w:rPr>
-        <w:t>– Nếu mã giảm giá hợp lệ, hệ thống áp dụng mức giảm theo điều kiện của chương trình và tính lại tổng tiền đơn hàng.</w:t>
-      </w:r>
-    </w:p>
-    <w:p>
-      <w:pPr>
-        <w:rPr>
-          <w:rFonts w:ascii="Times New Roman" w:hAnsi="Times New Roman" w:cs="Times New Roman"/>
-          <w:b/>
-          <w:bCs/>
-          <w:sz w:val="26"/>
-          <w:szCs w:val="26"/>
-          <w:lang w:val="vi-VN"/>
-        </w:rPr>
-      </w:pPr>
-      <w:r>
-        <w:rPr>
-          <w:rFonts w:ascii="Times New Roman" w:hAnsi="Times New Roman" w:cs="Times New Roman"/>
-          <w:b/>
-          <w:bCs/>
-          <w:sz w:val="26"/>
-          <w:szCs w:val="26"/>
-          <w:lang w:val="vi-VN"/>
-        </w:rPr>
-        <w:t>Quy trình nghiệp vụ của chức năng chăm sóc và thông báo khách hàng</w:t>
-      </w:r>
-    </w:p>
-    <w:p>
-      <w:pPr>
-        <w:rPr>
-          <w:rFonts w:ascii="Times New Roman" w:hAnsi="Times New Roman" w:cs="Times New Roman"/>
-          <w:sz w:val="26"/>
-          <w:szCs w:val="26"/>
-        </w:rPr>
-      </w:pPr>
-      <w:r>
-        <w:rPr>
-          <w:rFonts w:ascii="Times New Roman" w:hAnsi="Times New Roman" w:cs="Times New Roman"/>
-          <w:sz w:val="26"/>
-          <w:szCs w:val="26"/>
-        </w:rPr>
         <w:t>– Hệ thống lưu và tra cứu lịch sử mua hàng, lịch sử sử dụng dịch vụ, lịch tiêm phòng và lịch chăm sóc của thú cưng.</w:t>
       </w:r>
       <w:r>
@@ -3834,83 +3834,83 @@
           <w:sz w:val="26"/>
           <w:szCs w:val="26"/>
         </w:rPr>
+        <w:t>Quy trình quản lý dịch vụ và lịch hẹn</w:t>
+      </w:r>
+    </w:p>
+    <w:p>
+      <w:pPr>
+        <w:rPr>
+          <w:rFonts w:ascii="Times New Roman" w:hAnsi="Times New Roman" w:cs="Times New Roman"/>
+          <w:sz w:val="26"/>
+          <w:szCs w:val="26"/>
+        </w:rPr>
+      </w:pPr>
+      <w:r>
+        <w:rPr>
+          <w:rFonts w:ascii="Times New Roman" w:hAnsi="Times New Roman" w:cs="Times New Roman"/>
+          <w:sz w:val="26"/>
+          <w:szCs w:val="26"/>
+        </w:rPr>
+        <w:t>Quy trình thực hiện dịch vụ chăm sóc thú cưng</w:t>
+      </w:r>
+    </w:p>
+    <w:p>
+      <w:pPr>
+        <w:rPr>
+          <w:rFonts w:ascii="Times New Roman" w:hAnsi="Times New Roman" w:cs="Times New Roman"/>
+          <w:sz w:val="26"/>
+          <w:szCs w:val="26"/>
+        </w:rPr>
+      </w:pPr>
+      <w:r>
+        <w:rPr>
+          <w:rFonts w:ascii="Times New Roman" w:hAnsi="Times New Roman" w:cs="Times New Roman"/>
+          <w:sz w:val="26"/>
+          <w:szCs w:val="26"/>
+        </w:rPr>
+        <w:t>Quy trình quản lý khuyến mãi</w:t>
+      </w:r>
+    </w:p>
+    <w:p>
+      <w:pPr>
+        <w:rPr>
+          <w:rFonts w:ascii="Times New Roman" w:hAnsi="Times New Roman" w:cs="Times New Roman"/>
+          <w:sz w:val="26"/>
+          <w:szCs w:val="26"/>
+        </w:rPr>
+      </w:pPr>
+      <w:r>
+        <w:rPr>
+          <w:rFonts w:ascii="Times New Roman" w:hAnsi="Times New Roman" w:cs="Times New Roman"/>
+          <w:sz w:val="26"/>
+          <w:szCs w:val="26"/>
+        </w:rPr>
+        <w:t>Quy trình hỗ trợ chăm sóc khách hàng</w:t>
+      </w:r>
+    </w:p>
+    <w:p>
+      <w:pPr>
+        <w:rPr>
+          <w:rFonts w:ascii="Times New Roman" w:hAnsi="Times New Roman" w:cs="Times New Roman"/>
+          <w:sz w:val="26"/>
+          <w:szCs w:val="26"/>
+        </w:rPr>
+      </w:pPr>
+      <w:r>
+        <w:rPr>
+          <w:rFonts w:ascii="Times New Roman" w:hAnsi="Times New Roman" w:cs="Times New Roman"/>
+          <w:sz w:val="26"/>
+          <w:szCs w:val="26"/>
+        </w:rPr>
+        <w:t>Quy trình lập báo cáo và thống kê</w:t>
+      </w:r>
+    </w:p>
+    <w:p>
+      <w:pPr>
+        <w:pStyle w:val="Style2"/>
+      </w:pPr>
+      <w:r>
         <w:lastRenderedPageBreak/>
-        <w:t>Quy trình quản lý dịch vụ và lịch hẹn</w:t>
-      </w:r>
-    </w:p>
-    <w:p>
-      <w:pPr>
-        <w:rPr>
-          <w:rFonts w:ascii="Times New Roman" w:hAnsi="Times New Roman" w:cs="Times New Roman"/>
-          <w:sz w:val="26"/>
-          <w:szCs w:val="26"/>
-        </w:rPr>
-      </w:pPr>
-      <w:r>
-        <w:rPr>
-          <w:rFonts w:ascii="Times New Roman" w:hAnsi="Times New Roman" w:cs="Times New Roman"/>
-          <w:sz w:val="26"/>
-          <w:szCs w:val="26"/>
-        </w:rPr>
-        <w:t>Quy trình thực hiện dịch vụ chăm sóc thú cưng</w:t>
-      </w:r>
-    </w:p>
-    <w:p>
-      <w:pPr>
-        <w:rPr>
-          <w:rFonts w:ascii="Times New Roman" w:hAnsi="Times New Roman" w:cs="Times New Roman"/>
-          <w:sz w:val="26"/>
-          <w:szCs w:val="26"/>
-        </w:rPr>
-      </w:pPr>
-      <w:r>
-        <w:rPr>
-          <w:rFonts w:ascii="Times New Roman" w:hAnsi="Times New Roman" w:cs="Times New Roman"/>
-          <w:sz w:val="26"/>
-          <w:szCs w:val="26"/>
-        </w:rPr>
-        <w:t>Quy trình quản lý khuyến mãi</w:t>
-      </w:r>
-    </w:p>
-    <w:p>
-      <w:pPr>
-        <w:rPr>
-          <w:rFonts w:ascii="Times New Roman" w:hAnsi="Times New Roman" w:cs="Times New Roman"/>
-          <w:sz w:val="26"/>
-          <w:szCs w:val="26"/>
-        </w:rPr>
-      </w:pPr>
-      <w:r>
-        <w:rPr>
-          <w:rFonts w:ascii="Times New Roman" w:hAnsi="Times New Roman" w:cs="Times New Roman"/>
-          <w:sz w:val="26"/>
-          <w:szCs w:val="26"/>
-        </w:rPr>
-        <w:t>Quy trình hỗ trợ chăm sóc khách hàng</w:t>
-      </w:r>
-    </w:p>
-    <w:p>
-      <w:pPr>
-        <w:rPr>
-          <w:rFonts w:ascii="Times New Roman" w:hAnsi="Times New Roman" w:cs="Times New Roman"/>
-          <w:sz w:val="26"/>
-          <w:szCs w:val="26"/>
-        </w:rPr>
-      </w:pPr>
-      <w:r>
-        <w:rPr>
-          <w:rFonts w:ascii="Times New Roman" w:hAnsi="Times New Roman" w:cs="Times New Roman"/>
-          <w:sz w:val="26"/>
-          <w:szCs w:val="26"/>
-        </w:rPr>
-        <w:t>Quy trình lập báo cáo và thống kê</w:t>
-      </w:r>
-    </w:p>
-    <w:p>
-      <w:pPr>
-        <w:pStyle w:val="Style2"/>
-      </w:pPr>
-      <w:r>
         <w:t>Quy định:</w:t>
       </w:r>
     </w:p>
@@ -4264,8 +4264,84 @@
           <w:szCs w:val="26"/>
           <w:lang w:val="vi-VN"/>
         </w:rPr>
+        <w:t>Quy định về Nhập và Xuất Thú Cưng</w:t>
+      </w:r>
+    </w:p>
+    <w:p>
+      <w:pPr>
+        <w:rPr>
+          <w:rFonts w:ascii="Times New Roman" w:hAnsi="Times New Roman" w:cs="Times New Roman"/>
+          <w:sz w:val="26"/>
+          <w:szCs w:val="26"/>
+          <w:lang w:val="vi-VN"/>
+        </w:rPr>
+      </w:pPr>
+      <w:r>
+        <w:rPr>
+          <w:rFonts w:ascii="Times New Roman" w:hAnsi="Times New Roman" w:cs="Times New Roman"/>
+          <w:sz w:val="26"/>
+          <w:szCs w:val="26"/>
+          <w:lang w:val="vi-VN"/>
+        </w:rPr>
+        <w:t>Kiểm tra khi nhập: Thú cưng mới nhập phải được kiểm tra tình trạng sức khỏe trước khi đưa vào khu vực bán hàng.</w:t>
+      </w:r>
+    </w:p>
+    <w:p>
+      <w:pPr>
+        <w:rPr>
+          <w:rFonts w:ascii="Times New Roman" w:hAnsi="Times New Roman" w:cs="Times New Roman"/>
+          <w:sz w:val="26"/>
+          <w:szCs w:val="26"/>
+          <w:lang w:val="vi-VN"/>
+        </w:rPr>
+      </w:pPr>
+      <w:r>
+        <w:rPr>
+          <w:rFonts w:ascii="Times New Roman" w:hAnsi="Times New Roman" w:cs="Times New Roman"/>
+          <w:sz w:val="26"/>
+          <w:szCs w:val="26"/>
+          <w:lang w:val="vi-VN"/>
+        </w:rPr>
+        <w:t>Kiểm tra nguồn gốc: Chỉ tiếp nhận động vật có nguồn gốc rõ ràng và hợp pháp.</w:t>
+      </w:r>
+    </w:p>
+    <w:p>
+      <w:pPr>
+        <w:rPr>
+          <w:rFonts w:ascii="Times New Roman" w:hAnsi="Times New Roman" w:cs="Times New Roman"/>
+          <w:sz w:val="26"/>
+          <w:szCs w:val="26"/>
+          <w:lang w:val="vi-VN"/>
+        </w:rPr>
+      </w:pPr>
+      <w:r>
+        <w:rPr>
+          <w:rFonts w:ascii="Times New Roman" w:hAnsi="Times New Roman" w:cs="Times New Roman"/>
+          <w:sz w:val="26"/>
+          <w:szCs w:val="26"/>
+          <w:lang w:val="vi-VN"/>
+        </w:rPr>
+        <w:t>Theo dõi động vật mới: Thú cưng mới nhập cần được theo dõi trong thời gian phù hợp để phát hiện các dấu hiệu bệnh.</w:t>
+      </w:r>
+    </w:p>
+    <w:p>
+      <w:pPr>
+        <w:rPr>
+          <w:rFonts w:ascii="Times New Roman" w:hAnsi="Times New Roman" w:cs="Times New Roman"/>
+          <w:sz w:val="26"/>
+          <w:szCs w:val="26"/>
+          <w:lang w:val="vi-VN"/>
+        </w:rPr>
+      </w:pPr>
+      <w:r>
+        <w:rPr>
+          <w:rFonts w:ascii="Times New Roman" w:hAnsi="Times New Roman" w:cs="Times New Roman"/>
+          <w:sz w:val="26"/>
+          <w:szCs w:val="26"/>
+          <w:lang w:val="vi-VN"/>
+        </w:rPr>
         <w:lastRenderedPageBreak/>
-        <w:t>Quy định về Nhập và Xuất Thú Cưng</w:t>
+        <w:t>Ghi nhận thông tin: Cửa hàng phải lưu thông tin về ngày nhập, nguồn gốc, tình trạng sức khỏe và các giấy tờ liên quan.</w:t>
       </w:r>
     </w:p>
     <w:p>
@@ -4284,7 +4360,7 @@
           <w:szCs w:val="26"/>
           <w:lang w:val="vi-VN"/>
         </w:rPr>
-        <w:t>Kiểm tra khi nhập: Thú cưng mới nhập phải được kiểm tra tình trạng sức khỏe trước khi đưa vào khu vực bán hàng.</w:t>
+        <w:t>Kiểm tra trước khi bán: Trước khi giao cho khách hàng, nhân viên phải kiểm tra tình trạng sức khỏe của thú cưng.</w:t>
       </w:r>
     </w:p>
     <w:p>
@@ -4303,13 +4379,15 @@
           <w:szCs w:val="26"/>
           <w:lang w:val="vi-VN"/>
         </w:rPr>
-        <w:t>Kiểm tra nguồn gốc: Chỉ tiếp nhận động vật có nguồn gốc rõ ràng và hợp pháp.</w:t>
-      </w:r>
-    </w:p>
-    <w:p>
-      <w:pPr>
-        <w:rPr>
-          <w:rFonts w:ascii="Times New Roman" w:hAnsi="Times New Roman" w:cs="Times New Roman"/>
+        <w:t>Không bán thú cưng không đủ điều kiện: Không đưa vào giao dịch những cá thể đang mắc bệnh hoặc chưa đáp ứng các điều kiện cần thiết.</w:t>
+      </w:r>
+    </w:p>
+    <w:p>
+      <w:pPr>
+        <w:rPr>
+          <w:rFonts w:ascii="Times New Roman" w:hAnsi="Times New Roman" w:cs="Times New Roman"/>
+          <w:b/>
+          <w:bCs/>
           <w:sz w:val="26"/>
           <w:szCs w:val="26"/>
           <w:lang w:val="vi-VN"/>
@@ -4318,11 +4396,13 @@
       <w:r>
         <w:rPr>
           <w:rFonts w:ascii="Times New Roman" w:hAnsi="Times New Roman" w:cs="Times New Roman"/>
+          <w:b/>
+          <w:bCs/>
           <w:sz w:val="26"/>
           <w:szCs w:val="26"/>
           <w:lang w:val="vi-VN"/>
         </w:rPr>
-        <w:t>Theo dõi động vật mới: Thú cưng mới nhập cần được theo dõi trong thời gian phù hợp để phát hiện các dấu hiệu bệnh.</w:t>
+        <w:t>Quy định về Mua bán và Bàn giao Thú Cưng</w:t>
       </w:r>
     </w:p>
     <w:p>
@@ -4341,7 +4421,7 @@
           <w:szCs w:val="26"/>
           <w:lang w:val="vi-VN"/>
         </w:rPr>
-        <w:t>Ghi nhận thông tin: Cửa hàng phải lưu thông tin về ngày nhập, nguồn gốc, tình trạng sức khỏe và các giấy tờ liên quan.</w:t>
+        <w:t>Thông tin trung thực: Không được cố ý che giấu tình trạng sức khỏe, bệnh tật hoặc đặc điểm bất thường của thú cưng.</w:t>
       </w:r>
     </w:p>
     <w:p>
@@ -4360,7 +4440,7 @@
           <w:szCs w:val="26"/>
           <w:lang w:val="vi-VN"/>
         </w:rPr>
-        <w:t>Kiểm tra trước khi bán: Trước khi giao cho khách hàng, nhân viên phải kiểm tra tình trạng sức khỏe của thú cưng.</w:t>
+        <w:t>Thông tin giao dịch: Giao dịch cần ghi nhận thông tin thú cưng, giá bán, ngày bán và thông tin cần thiết của khách hàng.</w:t>
       </w:r>
     </w:p>
     <w:p>
@@ -4379,15 +4459,13 @@
           <w:szCs w:val="26"/>
           <w:lang w:val="vi-VN"/>
         </w:rPr>
-        <w:t>Không bán thú cưng không đủ điều kiện: Không đưa vào giao dịch những cá thể đang mắc bệnh hoặc chưa đáp ứng các điều kiện cần thiết.</w:t>
-      </w:r>
-    </w:p>
-    <w:p>
-      <w:pPr>
-        <w:rPr>
-          <w:rFonts w:ascii="Times New Roman" w:hAnsi="Times New Roman" w:cs="Times New Roman"/>
-          <w:b/>
-          <w:bCs/>
+        <w:t>Bàn giao: Khi bàn giao phải cung cấp các thông tin cần thiết về thức ăn, lịch tiêm phòng, tẩy giun và cách chăm sóc.</w:t>
+      </w:r>
+    </w:p>
+    <w:p>
+      <w:pPr>
+        <w:rPr>
+          <w:rFonts w:ascii="Times New Roman" w:hAnsi="Times New Roman" w:cs="Times New Roman"/>
           <w:sz w:val="26"/>
           <w:szCs w:val="26"/>
           <w:lang w:val="vi-VN"/>
@@ -4396,13 +4474,11 @@
       <w:r>
         <w:rPr>
           <w:rFonts w:ascii="Times New Roman" w:hAnsi="Times New Roman" w:cs="Times New Roman"/>
-          <w:b/>
-          <w:bCs/>
           <w:sz w:val="26"/>
           <w:szCs w:val="26"/>
           <w:lang w:val="vi-VN"/>
         </w:rPr>
-        <w:t>Quy định về Mua bán và Bàn giao Thú Cưng</w:t>
+        <w:t>Chính sách bảo hành sức khỏe: Cửa hàng cần quy định rõ thời gian và điều kiện bảo hành sức khỏe sau khi khách nhận thú cưng.</w:t>
       </w:r>
     </w:p>
     <w:p>
@@ -4421,32 +4497,159 @@
           <w:szCs w:val="26"/>
           <w:lang w:val="vi-VN"/>
         </w:rPr>
-        <w:t>Thông tin trung thực: Không được cố ý che giấu tình trạng sức khỏe, bệnh tật hoặc đặc điểm bất thường của thú cưng.</w:t>
-      </w:r>
-    </w:p>
-    <w:p>
-      <w:pPr>
-        <w:rPr>
-          <w:rFonts w:ascii="Times New Roman" w:hAnsi="Times New Roman" w:cs="Times New Roman"/>
+        <w:t>Đổi hoặc trả: Quy định cụ thể các trường hợp được đổi hoặc trả thú cưng nhằm bảo vệ quyền lợi của cả khách hàng và cửa hàng.</w:t>
+      </w:r>
+    </w:p>
+    <w:p>
+      <w:pPr>
+        <w:rPr>
+          <w:rFonts w:ascii="Times New Roman" w:hAnsi="Times New Roman" w:cs="Times New Roman"/>
+          <w:b/>
+          <w:bCs/>
+          <w:sz w:val="26"/>
+          <w:szCs w:val="26"/>
+        </w:rPr>
+      </w:pPr>
+      <w:r>
+        <w:rPr>
+          <w:rFonts w:ascii="Times New Roman" w:hAnsi="Times New Roman" w:cs="Times New Roman"/>
+          <w:b/>
+          <w:bCs/>
           <w:sz w:val="26"/>
           <w:szCs w:val="26"/>
           <w:lang w:val="vi-VN"/>
         </w:rPr>
-      </w:pPr>
-      <w:r>
-        <w:rPr>
-          <w:rFonts w:ascii="Times New Roman" w:hAnsi="Times New Roman" w:cs="Times New Roman"/>
+        <w:t>Quy định về</w:t>
+      </w:r>
+      <w:r>
+        <w:rPr>
+          <w:rFonts w:ascii="Times New Roman" w:hAnsi="Times New Roman" w:cs="Times New Roman"/>
+          <w:b/>
+          <w:bCs/>
+          <w:sz w:val="26"/>
+          <w:szCs w:val="26"/>
+        </w:rPr>
+        <w:t xml:space="preserve"> Quản lý</w:t>
+      </w:r>
+      <w:r>
+        <w:rPr>
+          <w:rFonts w:ascii="Times New Roman" w:hAnsi="Times New Roman" w:cs="Times New Roman"/>
+          <w:b/>
+          <w:bCs/>
           <w:sz w:val="26"/>
           <w:szCs w:val="26"/>
           <w:lang w:val="vi-VN"/>
         </w:rPr>
-        <w:t>Thông tin giao dịch: Giao dịch cần ghi nhận thông tin thú cưng, giá bán, ngày bán và thông tin cần thiết của khách hàng.</w:t>
-      </w:r>
-    </w:p>
-    <w:p>
-      <w:pPr>
-        <w:rPr>
-          <w:rFonts w:ascii="Times New Roman" w:hAnsi="Times New Roman" w:cs="Times New Roman"/>
+        <w:t xml:space="preserve"> Nhân viên Cửa hàng</w:t>
+      </w:r>
+    </w:p>
+    <w:p>
+      <w:pPr>
+        <w:rPr>
+          <w:rFonts w:ascii="Times New Roman" w:hAnsi="Times New Roman" w:cs="Times New Roman"/>
+          <w:sz w:val="26"/>
+          <w:szCs w:val="26"/>
+        </w:rPr>
+      </w:pPr>
+      <w:r>
+        <w:rPr>
+          <w:rFonts w:ascii="Times New Roman" w:hAnsi="Times New Roman" w:cs="Times New Roman"/>
+          <w:sz w:val="26"/>
+          <w:szCs w:val="26"/>
+        </w:rPr>
+        <w:t>Mỗi nhân viên được cấp một tài khoản riêng để sử dụng hệ thống.</w:t>
+      </w:r>
+    </w:p>
+    <w:p>
+      <w:pPr>
+        <w:rPr>
+          <w:rFonts w:ascii="Times New Roman" w:hAnsi="Times New Roman" w:cs="Times New Roman"/>
+          <w:sz w:val="26"/>
+          <w:szCs w:val="26"/>
+        </w:rPr>
+      </w:pPr>
+      <w:r>
+        <w:rPr>
+          <w:rFonts w:ascii="Times New Roman" w:hAnsi="Times New Roman" w:cs="Times New Roman"/>
+          <w:sz w:val="26"/>
+          <w:szCs w:val="26"/>
+        </w:rPr>
+        <w:t>Quyền truy cập được xác định theo vai trò của nhân viên như Chủ cửa hàng/Admin, Nhân viên bán hàng, Nhân viên chăm sóc</w:t>
+      </w:r>
+      <w:r>
+        <w:rPr>
+          <w:rFonts w:ascii="Times New Roman" w:hAnsi="Times New Roman" w:cs="Times New Roman"/>
+          <w:sz w:val="26"/>
+          <w:szCs w:val="26"/>
+        </w:rPr>
+        <w:t>, Nhân viên kho</w:t>
+      </w:r>
+      <w:r>
+        <w:rPr>
+          <w:rFonts w:ascii="Times New Roman" w:hAnsi="Times New Roman" w:cs="Times New Roman"/>
+          <w:sz w:val="26"/>
+          <w:szCs w:val="26"/>
+        </w:rPr>
+        <w:t xml:space="preserve"> và Thu ngân.</w:t>
+      </w:r>
+    </w:p>
+    <w:p>
+      <w:pPr>
+        <w:rPr>
+          <w:rFonts w:ascii="Times New Roman" w:hAnsi="Times New Roman" w:cs="Times New Roman"/>
+          <w:sz w:val="26"/>
+          <w:szCs w:val="26"/>
+        </w:rPr>
+      </w:pPr>
+      <w:r>
+        <w:rPr>
+          <w:rFonts w:ascii="Times New Roman" w:hAnsi="Times New Roman" w:cs="Times New Roman"/>
+          <w:sz w:val="26"/>
+          <w:szCs w:val="26"/>
+        </w:rPr>
+        <w:t>Nhân viên chỉ được phép sử dụng các chức năng thuộc quyền được cấp.</w:t>
+      </w:r>
+    </w:p>
+    <w:p>
+      <w:pPr>
+        <w:rPr>
+          <w:rFonts w:ascii="Times New Roman" w:hAnsi="Times New Roman" w:cs="Times New Roman"/>
+          <w:sz w:val="26"/>
+          <w:szCs w:val="26"/>
+        </w:rPr>
+      </w:pPr>
+      <w:r>
+        <w:rPr>
+          <w:rFonts w:ascii="Times New Roman" w:hAnsi="Times New Roman" w:cs="Times New Roman"/>
+          <w:sz w:val="26"/>
+          <w:szCs w:val="26"/>
+        </w:rPr>
+        <w:t>Tài khoản nhân viên nghỉ việc hoặc không còn quyền sử dụng phải được khóa.</w:t>
+      </w:r>
+    </w:p>
+    <w:p>
+      <w:pPr>
+        <w:rPr>
+          <w:rFonts w:ascii="Times New Roman" w:hAnsi="Times New Roman" w:cs="Times New Roman"/>
+          <w:sz w:val="26"/>
+          <w:szCs w:val="26"/>
+        </w:rPr>
+      </w:pPr>
+      <w:r>
+        <w:rPr>
+          <w:rFonts w:ascii="Times New Roman" w:hAnsi="Times New Roman" w:cs="Times New Roman"/>
+          <w:sz w:val="26"/>
+          <w:szCs w:val="26"/>
+        </w:rPr>
+        <w:t>Các thông tin quan trọng như người tạo đơn hàng, người thanh toán hoặc người cập nhật hồ sơ cần được ghi nhận để phục vụ tra cứu.</w:t>
+      </w:r>
+    </w:p>
+    <w:p>
+      <w:pPr>
+        <w:rPr>
+          <w:rFonts w:ascii="Times New Roman" w:hAnsi="Times New Roman" w:cs="Times New Roman"/>
+          <w:b/>
+          <w:bCs/>
           <w:sz w:val="26"/>
           <w:szCs w:val="26"/>
           <w:lang w:val="vi-VN"/>
@@ -4455,215 +4658,12 @@
       <w:r>
         <w:rPr>
           <w:rFonts w:ascii="Times New Roman" w:hAnsi="Times New Roman" w:cs="Times New Roman"/>
+          <w:b/>
+          <w:bCs/>
           <w:sz w:val="26"/>
           <w:szCs w:val="26"/>
           <w:lang w:val="vi-VN"/>
         </w:rPr>
-        <w:t>Bàn giao: Khi bàn giao phải cung cấp các thông tin cần thiết về thức ăn, lịch tiêm phòng, tẩy giun và cách chăm sóc.</w:t>
-      </w:r>
-    </w:p>
-    <w:p>
-      <w:pPr>
-        <w:rPr>
-          <w:rFonts w:ascii="Times New Roman" w:hAnsi="Times New Roman" w:cs="Times New Roman"/>
-          <w:sz w:val="26"/>
-          <w:szCs w:val="26"/>
-          <w:lang w:val="vi-VN"/>
-        </w:rPr>
-      </w:pPr>
-      <w:r>
-        <w:rPr>
-          <w:rFonts w:ascii="Times New Roman" w:hAnsi="Times New Roman" w:cs="Times New Roman"/>
-          <w:sz w:val="26"/>
-          <w:szCs w:val="26"/>
-          <w:lang w:val="vi-VN"/>
-        </w:rPr>
-        <w:t>Chính sách bảo hành sức khỏe: Cửa hàng cần quy định rõ thời gian và điều kiện bảo hành sức khỏe sau khi khách nhận thú cưng.</w:t>
-      </w:r>
-    </w:p>
-    <w:p>
-      <w:pPr>
-        <w:rPr>
-          <w:rFonts w:ascii="Times New Roman" w:hAnsi="Times New Roman" w:cs="Times New Roman"/>
-          <w:sz w:val="26"/>
-          <w:szCs w:val="26"/>
-          <w:lang w:val="vi-VN"/>
-        </w:rPr>
-      </w:pPr>
-      <w:r>
-        <w:rPr>
-          <w:rFonts w:ascii="Times New Roman" w:hAnsi="Times New Roman" w:cs="Times New Roman"/>
-          <w:sz w:val="26"/>
-          <w:szCs w:val="26"/>
-          <w:lang w:val="vi-VN"/>
-        </w:rPr>
-        <w:t>Đổi hoặc trả: Quy định cụ thể các trường hợp được đổi hoặc trả thú cưng nhằm bảo vệ quyền lợi của cả khách hàng và cửa hàng.</w:t>
-      </w:r>
-    </w:p>
-    <w:p>
-      <w:pPr>
-        <w:rPr>
-          <w:rFonts w:ascii="Times New Roman" w:hAnsi="Times New Roman" w:cs="Times New Roman"/>
-          <w:b/>
-          <w:bCs/>
-          <w:sz w:val="26"/>
-          <w:szCs w:val="26"/>
-        </w:rPr>
-      </w:pPr>
-      <w:r>
-        <w:rPr>
-          <w:rFonts w:ascii="Times New Roman" w:hAnsi="Times New Roman" w:cs="Times New Roman"/>
-          <w:b/>
-          <w:bCs/>
-          <w:sz w:val="26"/>
-          <w:szCs w:val="26"/>
-          <w:lang w:val="vi-VN"/>
-        </w:rPr>
-        <w:t>Quy định về</w:t>
-      </w:r>
-      <w:r>
-        <w:rPr>
-          <w:rFonts w:ascii="Times New Roman" w:hAnsi="Times New Roman" w:cs="Times New Roman"/>
-          <w:b/>
-          <w:bCs/>
-          <w:sz w:val="26"/>
-          <w:szCs w:val="26"/>
-        </w:rPr>
-        <w:t xml:space="preserve"> Quản lý</w:t>
-      </w:r>
-      <w:r>
-        <w:rPr>
-          <w:rFonts w:ascii="Times New Roman" w:hAnsi="Times New Roman" w:cs="Times New Roman"/>
-          <w:b/>
-          <w:bCs/>
-          <w:sz w:val="26"/>
-          <w:szCs w:val="26"/>
-          <w:lang w:val="vi-VN"/>
-        </w:rPr>
-        <w:t xml:space="preserve"> Nhân viên Cửa hàng</w:t>
-      </w:r>
-    </w:p>
-    <w:p>
-      <w:pPr>
-        <w:rPr>
-          <w:rFonts w:ascii="Times New Roman" w:hAnsi="Times New Roman" w:cs="Times New Roman"/>
-          <w:sz w:val="26"/>
-          <w:szCs w:val="26"/>
-        </w:rPr>
-      </w:pPr>
-      <w:r>
-        <w:rPr>
-          <w:rFonts w:ascii="Times New Roman" w:hAnsi="Times New Roman" w:cs="Times New Roman"/>
-          <w:sz w:val="26"/>
-          <w:szCs w:val="26"/>
-        </w:rPr>
-        <w:t>Mỗi nhân viên được cấp một tài khoản riêng để sử dụng hệ thống.</w:t>
-      </w:r>
-    </w:p>
-    <w:p>
-      <w:pPr>
-        <w:rPr>
-          <w:rFonts w:ascii="Times New Roman" w:hAnsi="Times New Roman" w:cs="Times New Roman"/>
-          <w:sz w:val="26"/>
-          <w:szCs w:val="26"/>
-        </w:rPr>
-      </w:pPr>
-      <w:r>
-        <w:rPr>
-          <w:rFonts w:ascii="Times New Roman" w:hAnsi="Times New Roman" w:cs="Times New Roman"/>
-          <w:sz w:val="26"/>
-          <w:szCs w:val="26"/>
-        </w:rPr>
-        <w:t>Quyền truy cập được xác định theo vai trò của nhân viên như Chủ cửa hàng/Admin, Nhân viên bán hàng, Nhân viên chăm sóc</w:t>
-      </w:r>
-      <w:r>
-        <w:rPr>
-          <w:rFonts w:ascii="Times New Roman" w:hAnsi="Times New Roman" w:cs="Times New Roman"/>
-          <w:sz w:val="26"/>
-          <w:szCs w:val="26"/>
-        </w:rPr>
-        <w:t>, Nhân viên kho</w:t>
-      </w:r>
-      <w:r>
-        <w:rPr>
-          <w:rFonts w:ascii="Times New Roman" w:hAnsi="Times New Roman" w:cs="Times New Roman"/>
-          <w:sz w:val="26"/>
-          <w:szCs w:val="26"/>
-        </w:rPr>
-        <w:t xml:space="preserve"> và Thu ngân.</w:t>
-      </w:r>
-    </w:p>
-    <w:p>
-      <w:pPr>
-        <w:rPr>
-          <w:rFonts w:ascii="Times New Roman" w:hAnsi="Times New Roman" w:cs="Times New Roman"/>
-          <w:sz w:val="26"/>
-          <w:szCs w:val="26"/>
-        </w:rPr>
-      </w:pPr>
-      <w:r>
-        <w:rPr>
-          <w:rFonts w:ascii="Times New Roman" w:hAnsi="Times New Roman" w:cs="Times New Roman"/>
-          <w:sz w:val="26"/>
-          <w:szCs w:val="26"/>
-        </w:rPr>
-        <w:t>Nhân viên chỉ được phép sử dụng các chức năng thuộc quyền được cấp.</w:t>
-      </w:r>
-    </w:p>
-    <w:p>
-      <w:pPr>
-        <w:rPr>
-          <w:rFonts w:ascii="Times New Roman" w:hAnsi="Times New Roman" w:cs="Times New Roman"/>
-          <w:sz w:val="26"/>
-          <w:szCs w:val="26"/>
-        </w:rPr>
-      </w:pPr>
-      <w:r>
-        <w:rPr>
-          <w:rFonts w:ascii="Times New Roman" w:hAnsi="Times New Roman" w:cs="Times New Roman"/>
-          <w:sz w:val="26"/>
-          <w:szCs w:val="26"/>
-        </w:rPr>
-        <w:t>Tài khoản nhân viên nghỉ việc hoặc không còn quyền sử dụng phải được khóa.</w:t>
-      </w:r>
-    </w:p>
-    <w:p>
-      <w:pPr>
-        <w:rPr>
-          <w:rFonts w:ascii="Times New Roman" w:hAnsi="Times New Roman" w:cs="Times New Roman"/>
-          <w:sz w:val="26"/>
-          <w:szCs w:val="26"/>
-        </w:rPr>
-      </w:pPr>
-      <w:r>
-        <w:rPr>
-          <w:rFonts w:ascii="Times New Roman" w:hAnsi="Times New Roman" w:cs="Times New Roman"/>
-          <w:sz w:val="26"/>
-          <w:szCs w:val="26"/>
-        </w:rPr>
-        <w:t>Các thông tin quan trọng như người tạo đơn hàng, người thanh toán hoặc người cập nhật hồ sơ cần được ghi nhận để phục vụ tra cứu.</w:t>
-      </w:r>
-    </w:p>
-    <w:p>
-      <w:pPr>
-        <w:rPr>
-          <w:rFonts w:ascii="Times New Roman" w:hAnsi="Times New Roman" w:cs="Times New Roman"/>
-          <w:b/>
-          <w:bCs/>
-          <w:sz w:val="26"/>
-          <w:szCs w:val="26"/>
-          <w:lang w:val="vi-VN"/>
-        </w:rPr>
-      </w:pPr>
-      <w:r>
-        <w:rPr>
-          <w:rFonts w:ascii="Times New Roman" w:hAnsi="Times New Roman" w:cs="Times New Roman"/>
-          <w:b/>
-          <w:bCs/>
-          <w:sz w:val="26"/>
-          <w:szCs w:val="26"/>
-          <w:lang w:val="vi-VN"/>
-        </w:rPr>
         <w:t>Quy định về Quản lý Hồ sơ</w:t>
       </w:r>
     </w:p>
@@ -4681,75 +4681,75 @@
           <w:sz w:val="26"/>
           <w:szCs w:val="26"/>
         </w:rPr>
+        <w:t>Hồ sơ thú cưng: Hệ thống lưu thông tin nhận dạng, giống, loài, giới tính, ngày sinh, nguồn gốc và tình trạng của từng thú cưng.</w:t>
+      </w:r>
+    </w:p>
+    <w:p>
+      <w:pPr>
+        <w:rPr>
+          <w:rFonts w:ascii="Times New Roman" w:hAnsi="Times New Roman" w:cs="Times New Roman"/>
+          <w:sz w:val="26"/>
+          <w:szCs w:val="26"/>
+        </w:rPr>
+      </w:pPr>
+      <w:r>
+        <w:rPr>
+          <w:rFonts w:ascii="Times New Roman" w:hAnsi="Times New Roman" w:cs="Times New Roman"/>
+          <w:sz w:val="26"/>
+          <w:szCs w:val="26"/>
+        </w:rPr>
+        <w:t>Hồ sơ sức khỏe: Lưu lịch sử tiêm phòng, tẩy giun, tình trạng sức khỏe và các ghi chú cần thiết.</w:t>
+      </w:r>
+    </w:p>
+    <w:p>
+      <w:pPr>
+        <w:rPr>
+          <w:rFonts w:ascii="Times New Roman" w:hAnsi="Times New Roman" w:cs="Times New Roman"/>
+          <w:sz w:val="26"/>
+          <w:szCs w:val="26"/>
+        </w:rPr>
+      </w:pPr>
+      <w:r>
+        <w:rPr>
+          <w:rFonts w:ascii="Times New Roman" w:hAnsi="Times New Roman" w:cs="Times New Roman"/>
+          <w:sz w:val="26"/>
+          <w:szCs w:val="26"/>
+        </w:rPr>
+        <w:t>Lịch sử chăm sóc: Ghi nhận các dịch vụ thú cưng đã sử dụng và tình trạng sau mỗi lần chăm sóc.</w:t>
+      </w:r>
+    </w:p>
+    <w:p>
+      <w:pPr>
+        <w:rPr>
+          <w:rFonts w:ascii="Times New Roman" w:hAnsi="Times New Roman" w:cs="Times New Roman"/>
+          <w:sz w:val="26"/>
+          <w:szCs w:val="26"/>
+        </w:rPr>
+      </w:pPr>
+      <w:r>
+        <w:rPr>
+          <w:rFonts w:ascii="Times New Roman" w:hAnsi="Times New Roman" w:cs="Times New Roman"/>
+          <w:sz w:val="26"/>
+          <w:szCs w:val="26"/>
+        </w:rPr>
+        <w:t>Hồ sơ nhập – bán: Lưu ngày nhập, nguồn nhập, ngày bán và giao dịch liên quan.</w:t>
+      </w:r>
+    </w:p>
+    <w:p>
+      <w:pPr>
+        <w:rPr>
+          <w:rFonts w:ascii="Times New Roman" w:hAnsi="Times New Roman" w:cs="Times New Roman"/>
+          <w:sz w:val="26"/>
+          <w:szCs w:val="26"/>
+        </w:rPr>
+      </w:pPr>
+      <w:r>
+        <w:rPr>
+          <w:rFonts w:ascii="Times New Roman" w:hAnsi="Times New Roman" w:cs="Times New Roman"/>
+          <w:sz w:val="26"/>
+          <w:szCs w:val="26"/>
+        </w:rPr>
         <w:lastRenderedPageBreak/>
-        <w:t>Hồ sơ thú cưng: Hệ thống lưu thông tin nhận dạng, giống, loài, giới tính, ngày sinh, nguồn gốc và tình trạng của từng thú cưng.</w:t>
-      </w:r>
-    </w:p>
-    <w:p>
-      <w:pPr>
-        <w:rPr>
-          <w:rFonts w:ascii="Times New Roman" w:hAnsi="Times New Roman" w:cs="Times New Roman"/>
-          <w:sz w:val="26"/>
-          <w:szCs w:val="26"/>
-        </w:rPr>
-      </w:pPr>
-      <w:r>
-        <w:rPr>
-          <w:rFonts w:ascii="Times New Roman" w:hAnsi="Times New Roman" w:cs="Times New Roman"/>
-          <w:sz w:val="26"/>
-          <w:szCs w:val="26"/>
-        </w:rPr>
-        <w:t>Hồ sơ sức khỏe: Lưu lịch sử tiêm phòng, tẩy giun, tình trạng sức khỏe và các ghi chú cần thiết.</w:t>
-      </w:r>
-    </w:p>
-    <w:p>
-      <w:pPr>
-        <w:rPr>
-          <w:rFonts w:ascii="Times New Roman" w:hAnsi="Times New Roman" w:cs="Times New Roman"/>
-          <w:sz w:val="26"/>
-          <w:szCs w:val="26"/>
-        </w:rPr>
-      </w:pPr>
-      <w:r>
-        <w:rPr>
-          <w:rFonts w:ascii="Times New Roman" w:hAnsi="Times New Roman" w:cs="Times New Roman"/>
-          <w:sz w:val="26"/>
-          <w:szCs w:val="26"/>
-        </w:rPr>
-        <w:t>Lịch sử chăm sóc: Ghi nhận các dịch vụ thú cưng đã sử dụng và tình trạng sau mỗi lần chăm sóc.</w:t>
-      </w:r>
-    </w:p>
-    <w:p>
-      <w:pPr>
-        <w:rPr>
-          <w:rFonts w:ascii="Times New Roman" w:hAnsi="Times New Roman" w:cs="Times New Roman"/>
-          <w:sz w:val="26"/>
-          <w:szCs w:val="26"/>
-        </w:rPr>
-      </w:pPr>
-      <w:r>
-        <w:rPr>
-          <w:rFonts w:ascii="Times New Roman" w:hAnsi="Times New Roman" w:cs="Times New Roman"/>
-          <w:sz w:val="26"/>
-          <w:szCs w:val="26"/>
-        </w:rPr>
-        <w:t>Hồ sơ nhập – bán: Lưu ngày nhập, nguồn nhập, ngày bán và giao dịch liên quan.</w:t>
-      </w:r>
-    </w:p>
-    <w:p>
-      <w:pPr>
-        <w:rPr>
-          <w:rFonts w:ascii="Times New Roman" w:hAnsi="Times New Roman" w:cs="Times New Roman"/>
-          <w:sz w:val="26"/>
-          <w:szCs w:val="26"/>
-        </w:rPr>
-      </w:pPr>
-      <w:r>
-        <w:rPr>
-          <w:rFonts w:ascii="Times New Roman" w:hAnsi="Times New Roman" w:cs="Times New Roman"/>
-          <w:sz w:val="26"/>
-          <w:szCs w:val="26"/>
-        </w:rPr>
         <w:t>Thông tin khách hàng: Thông tin khách hàng và lịch sử giao dịch phải được lưu trữ và chỉ được truy cập bởi người có quyền.</w:t>
       </w:r>
     </w:p>
@@ -5277,17 +5277,7 @@
                 <w:szCs w:val="26"/>
                 <w:lang w:val="vi-VN"/>
               </w:rPr>
-              <w:t xml:space="preserve">Theo tôi hiểu, Chủ cửa hàng/Admin có thể tạo tài khoản cho nhân viên bằng cách nhập thông tin nhân viên và gán vai trò tương ứng. Hệ thống sẽ </w:t>
-            </w:r>
-            <w:r>
-              <w:rPr>
-                <w:rFonts w:ascii="Times New Roman" w:hAnsi="Times New Roman" w:cs="Times New Roman"/>
-                <w:sz w:val="26"/>
-                <w:szCs w:val="26"/>
-                <w:lang w:val="vi-VN"/>
-              </w:rPr>
-              <w:lastRenderedPageBreak/>
-              <w:t>kiểm tra tính hợp lệ và chỉ tạo tài khoản khi thông tin chưa tồn tại. Tôi hiểu như vậy có đúng không?</w:t>
+              <w:t>Theo tôi hiểu, Chủ cửa hàng/Admin có thể tạo tài khoản cho nhân viên bằng cách nhập thông tin nhân viên và gán vai trò tương ứng. Hệ thống sẽ kiểm tra tính hợp lệ và chỉ tạo tài khoản khi thông tin chưa tồn tại. Tôi hiểu như vậy có đúng không?</w:t>
             </w:r>
           </w:p>
         </w:tc>
@@ -5311,17 +5301,7 @@
                 <w:sz w:val="26"/>
                 <w:szCs w:val="26"/>
               </w:rPr>
-              <w:lastRenderedPageBreak/>
-              <w:t xml:space="preserve">Đúng. Admin có thể tạo tài khoản cho nhân viên và gán quyền theo vai trò. Hệ thống kiểm tra thông tin trước khi lưu và thông báo nếu tài khoản </w:t>
-            </w:r>
-            <w:r>
-              <w:rPr>
-                <w:rFonts w:ascii="Times New Roman" w:hAnsi="Times New Roman" w:cs="Times New Roman"/>
-                <w:sz w:val="26"/>
-                <w:szCs w:val="26"/>
-              </w:rPr>
-              <w:lastRenderedPageBreak/>
-              <w:t>hoặc email đã tồn tại.</w:t>
+              <w:t>Đúng. Admin có thể tạo tài khoản cho nhân viên và gán quyền theo vai trò. Hệ thống kiểm tra thông tin trước khi lưu và thông báo nếu tài khoản hoặc email đã tồn tại.</w:t>
             </w:r>
             <w:r>
               <w:rPr>
@@ -5353,7 +5333,6 @@
                 <w:sz w:val="26"/>
                 <w:szCs w:val="26"/>
               </w:rPr>
-              <w:lastRenderedPageBreak/>
               <w:t>Module: Quản lý tài khoản / Screen: Quản lý tài khoản nhân viên</w:t>
             </w:r>
           </w:p>
@@ -5408,7 +5387,17 @@
                 <w:szCs w:val="26"/>
                 <w:lang w:val="vi-VN"/>
               </w:rPr>
-              <w:t>Theo tôi hiểu, khi khách hàng yêu cầu hủy đơn tại cửa hàng, nhân viên sẽ kiểm tra trạng thái đơn hàng. Nếu đơn đang chờ thanh toán thì có thể hủy trực tiếp; nếu đã thanh toán thì Thu ngân cần xử lý hoàn tiền trước khi hoàn tất hủy đơn. Tôi hiểu như vậy có đúng không?</w:t>
+              <w:t xml:space="preserve">Theo tôi hiểu, khi khách hàng yêu cầu hủy đơn tại </w:t>
+            </w:r>
+            <w:r>
+              <w:rPr>
+                <w:rFonts w:ascii="Times New Roman" w:hAnsi="Times New Roman" w:cs="Times New Roman"/>
+                <w:sz w:val="26"/>
+                <w:szCs w:val="26"/>
+                <w:lang w:val="vi-VN"/>
+              </w:rPr>
+              <w:lastRenderedPageBreak/>
+              <w:t>cửa hàng, nhân viên sẽ kiểm tra trạng thái đơn hàng. Nếu đơn đang chờ thanh toán thì có thể hủy trực tiếp; nếu đã thanh toán thì Thu ngân cần xử lý hoàn tiền trước khi hoàn tất hủy đơn. Tôi hiểu như vậy có đúng không?</w:t>
             </w:r>
           </w:p>
         </w:tc>
@@ -5432,7 +5421,17 @@
                 <w:sz w:val="26"/>
                 <w:szCs w:val="26"/>
               </w:rPr>
-              <w:t>Đúng. Hệ thống kiểm tra trạng thái đơn trước khi cho phép hủy, ghi nhận thông tin hoàn tiền nếu có và cập nhật lại số lượng tồn kho khi cần.</w:t>
+              <w:lastRenderedPageBreak/>
+              <w:t xml:space="preserve">Đúng. Hệ thống kiểm tra trạng thái đơn trước khi cho phép </w:t>
+            </w:r>
+            <w:r>
+              <w:rPr>
+                <w:rFonts w:ascii="Times New Roman" w:hAnsi="Times New Roman" w:cs="Times New Roman"/>
+                <w:sz w:val="26"/>
+                <w:szCs w:val="26"/>
+              </w:rPr>
+              <w:lastRenderedPageBreak/>
+              <w:t>hủy, ghi nhận thông tin hoàn tiền nếu có và cập nhật lại số lượng tồn kho khi cần.</w:t>
             </w:r>
           </w:p>
         </w:tc>
@@ -5455,7 +5454,17 @@
                 <w:sz w:val="26"/>
                 <w:szCs w:val="26"/>
               </w:rPr>
-              <w:t>Module: Quản lý bán hàng &amp; thanh toán / Screen: Chi tiết đơn hàng, Hoàn tiền</w:t>
+              <w:lastRenderedPageBreak/>
+              <w:t xml:space="preserve">Module: Quản lý bán hàng &amp; thanh toán / </w:t>
+            </w:r>
+            <w:r>
+              <w:rPr>
+                <w:rFonts w:ascii="Times New Roman" w:hAnsi="Times New Roman" w:cs="Times New Roman"/>
+                <w:sz w:val="26"/>
+                <w:szCs w:val="26"/>
+              </w:rPr>
+              <w:lastRenderedPageBreak/>
+              <w:t>Screen: Chi tiết đơn hàng, Hoàn tiền</w:t>
             </w:r>
           </w:p>
         </w:tc>
@@ -5484,6 +5493,7 @@
                 <w:sz w:val="26"/>
                 <w:szCs w:val="26"/>
               </w:rPr>
+              <w:lastRenderedPageBreak/>
               <w:t>4.</w:t>
             </w:r>
           </w:p>
@@ -5749,16 +5759,7 @@
                 <w:sz w:val="26"/>
                 <w:szCs w:val="26"/>
               </w:rPr>
-              <w:t xml:space="preserve">Theo tôi hiểu, Admin có thể tạo chương trình khuyến mãi bằng cách thiết lập mã giảm giá, mức giảm, điều kiện và thời gian áp dụng. Khi </w:t>
-            </w:r>
-            <w:r>
-              <w:rPr>
-                <w:rFonts w:ascii="Times New Roman" w:hAnsi="Times New Roman" w:cs="Times New Roman"/>
-                <w:sz w:val="26"/>
-                <w:szCs w:val="26"/>
-              </w:rPr>
-              <w:lastRenderedPageBreak/>
-              <w:t>khách hàng sử dụng mã, hệ thống sẽ kiểm tra tính hợp lệ trước khi tính lại tổng tiền. Tôi hiểu như vậy có đúng không?</w:t>
+              <w:t>Theo tôi hiểu, Admin có thể tạo chương trình khuyến mãi bằng cách thiết lập mã giảm giá, mức giảm, điều kiện và thời gian áp dụng. Khi khách hàng sử dụng mã, hệ thống sẽ kiểm tra tính hợp lệ trước khi tính lại tổng tiền. Tôi hiểu như vậy có đúng không?</w:t>
             </w:r>
           </w:p>
         </w:tc>
@@ -5782,7 +5783,6 @@
                 <w:sz w:val="26"/>
                 <w:szCs w:val="26"/>
               </w:rPr>
-              <w:lastRenderedPageBreak/>
               <w:t>Đúng. Hệ thống chỉ áp dụng giảm giá khi mã còn hiệu lực và đáp ứng điều kiện của chương trình; nếu không hợp lệ thì thông báo cho khách hàng.</w:t>
             </w:r>
           </w:p>
@@ -5859,7 +5859,16 @@
                 <w:sz w:val="26"/>
                 <w:szCs w:val="26"/>
               </w:rPr>
-              <w:t>Theo tôi hiểu, khi khách hàng có nhu cầu đặt lịch chăm sóc thú cưng, nhân viên sẽ chọn khách hàng, thú cưng, dịch vụ, nhân viên chăm sóc, ngày và giờ. Hệ thống kiểm tra lịch trống trước khi tạo lịch hẹn. Tôi hiểu như vậy có đúng không?</w:t>
+              <w:t xml:space="preserve">Theo tôi hiểu, khi khách hàng có nhu cầu đặt lịch </w:t>
+            </w:r>
+            <w:r>
+              <w:rPr>
+                <w:rFonts w:ascii="Times New Roman" w:hAnsi="Times New Roman" w:cs="Times New Roman"/>
+                <w:sz w:val="26"/>
+                <w:szCs w:val="26"/>
+              </w:rPr>
+              <w:lastRenderedPageBreak/>
+              <w:t>chăm sóc thú cưng, nhân viên sẽ chọn khách hàng, thú cưng, dịch vụ, nhân viên chăm sóc, ngày và giờ. Hệ thống kiểm tra lịch trống trước khi tạo lịch hẹn. Tôi hiểu như vậy có đúng không?</w:t>
             </w:r>
           </w:p>
         </w:tc>
@@ -5883,7 +5892,17 @@
                 <w:sz w:val="26"/>
                 <w:szCs w:val="26"/>
               </w:rPr>
-              <w:t>Đúng. Nếu khung giờ đã có lịch, hệ thống thông báo để nhân viên chọn thời gian khác; nếu còn trống, hệ thống tạo lịch hẹn và lưu thông tin liên quan.</w:t>
+              <w:lastRenderedPageBreak/>
+              <w:t xml:space="preserve">Đúng. Nếu khung giờ đã có lịch, hệ thống thông báo để </w:t>
+            </w:r>
+            <w:r>
+              <w:rPr>
+                <w:rFonts w:ascii="Times New Roman" w:hAnsi="Times New Roman" w:cs="Times New Roman"/>
+                <w:sz w:val="26"/>
+                <w:szCs w:val="26"/>
+              </w:rPr>
+              <w:lastRenderedPageBreak/>
+              <w:t>nhân viên chọn thời gian khác; nếu còn trống, hệ thống tạo lịch hẹn và lưu thông tin liên quan.</w:t>
             </w:r>
           </w:p>
         </w:tc>
@@ -5906,7 +5925,17 @@
                 <w:sz w:val="26"/>
                 <w:szCs w:val="26"/>
               </w:rPr>
-              <w:t>Module: Quản lý nhà cung cấp / Screen: Thông tin nhà cung cấp</w:t>
+              <w:lastRenderedPageBreak/>
+              <w:t xml:space="preserve">Module: Quản lý nhà cung cấp / Screen: </w:t>
+            </w:r>
+            <w:r>
+              <w:rPr>
+                <w:rFonts w:ascii="Times New Roman" w:hAnsi="Times New Roman" w:cs="Times New Roman"/>
+                <w:sz w:val="26"/>
+                <w:szCs w:val="26"/>
+              </w:rPr>
+              <w:lastRenderedPageBreak/>
+              <w:t>Thông tin nhà cung cấp</w:t>
             </w:r>
           </w:p>
         </w:tc>
@@ -5935,6 +5964,7 @@
                 <w:sz w:val="26"/>
                 <w:szCs w:val="26"/>
               </w:rPr>
+              <w:lastRenderedPageBreak/>
               <w:t>8.</w:t>
             </w:r>
           </w:p>
@@ -6219,16 +6249,7 @@
                 <w:sz w:val="26"/>
                 <w:szCs w:val="26"/>
               </w:rPr>
-              <w:t xml:space="preserve">Theo tôi hiểu, Admin có thể xem báo cáo theo ngày, tháng hoặc năm, bao gồm doanh thu, số lượng đơn hàng, sản </w:t>
-            </w:r>
-            <w:r>
-              <w:rPr>
-                <w:rFonts w:ascii="Times New Roman" w:hAnsi="Times New Roman" w:cs="Times New Roman"/>
-                <w:sz w:val="26"/>
-                <w:szCs w:val="26"/>
-              </w:rPr>
-              <w:lastRenderedPageBreak/>
-              <w:t>phẩm bán chạy, tồn kho và doanh thu dịch vụ. Hệ thống cũng cho phép xuất kết quả báo cáo. Tôi hiểu như vậy có đúng không?</w:t>
+              <w:t>Theo tôi hiểu, Admin có thể xem báo cáo theo ngày, tháng hoặc năm, bao gồm doanh thu, số lượng đơn hàng, sản phẩm bán chạy, tồn kho và doanh thu dịch vụ. Hệ thống cũng cho phép xuất kết quả báo cáo. Tôi hiểu như vậy có đúng không?</w:t>
             </w:r>
           </w:p>
         </w:tc>
@@ -6252,7 +6273,6 @@
                 <w:sz w:val="26"/>
                 <w:szCs w:val="26"/>
               </w:rPr>
-              <w:lastRenderedPageBreak/>
               <w:t>Đúng. Admin chọn loại báo cáo và khoảng thời gian, hệ thống tổng hợp dữ liệu, hiển thị kết quả và cho phép xuất báo cáo</w:t>
             </w:r>
           </w:p>
@@ -6306,6 +6326,7 @@
           <w:b/>
           <w:bCs/>
         </w:rPr>
+        <w:lastRenderedPageBreak/>
         <w:t>Yêu cầ</w:t>
       </w:r>
       <w:r>
@@ -6885,7 +6906,6 @@
           <w:sz w:val="26"/>
           <w:szCs w:val="26"/>
         </w:rPr>
-        <w:lastRenderedPageBreak/>
         <w:t>Quản lý thanh toán:</w:t>
       </w:r>
       <w:r>
@@ -7034,6 +7054,7 @@
           <w:sz w:val="26"/>
           <w:szCs w:val="26"/>
         </w:rPr>
+        <w:lastRenderedPageBreak/>
         <w:t>Quản lý nhập hàng:</w:t>
       </w:r>
       <w:r>
@@ -7440,6 +7461,7 @@
           <w:b/>
           <w:bCs/>
         </w:rPr>
+        <w:lastRenderedPageBreak/>
         <w:t>Sơ đồ phân cấp chức năng của ứng dụn</w:t>
       </w:r>
       <w:r>
@@ -7454,6 +7476,43 @@
       <w:pPr>
         <w:jc w:val="center"/>
       </w:pPr>
+      <w:r>
+        <w:drawing>
+          <wp:inline distT="0" distB="0" distL="0" distR="0" wp14:anchorId="6B6082F7" wp14:editId="11F8EA94">
+            <wp:extent cx="6511925" cy="7070725"/>
+            <wp:effectExtent l="0" t="0" r="3175" b="0"/>
+            <wp:docPr id="1689894460" name="Picture 1"/>
+            <wp:cNvGraphicFramePr>
+              <a:graphicFrameLocks xmlns:a="http://schemas.openxmlformats.org/drawingml/2006/main" noChangeAspect="1"/>
+            </wp:cNvGraphicFramePr>
+            <a:graphic xmlns:a="http://schemas.openxmlformats.org/drawingml/2006/main">
+              <a:graphicData uri="http://schemas.openxmlformats.org/drawingml/2006/picture">
+                <pic:pic xmlns:pic="http://schemas.openxmlformats.org/drawingml/2006/picture">
+                  <pic:nvPicPr>
+                    <pic:cNvPr id="1689894460" name=""/>
+                    <pic:cNvPicPr/>
+                  </pic:nvPicPr>
+                  <pic:blipFill>
+                    <a:blip r:embed="rId8"/>
+                    <a:stretch>
+                      <a:fillRect/>
+                    </a:stretch>
+                  </pic:blipFill>
+                  <pic:spPr>
+                    <a:xfrm>
+                      <a:off x="0" y="0"/>
+                      <a:ext cx="6511925" cy="7070725"/>
+                    </a:xfrm>
+                    <a:prstGeom prst="rect">
+                      <a:avLst/>
+                    </a:prstGeom>
+                  </pic:spPr>
+                </pic:pic>
+              </a:graphicData>
+            </a:graphic>
+          </wp:inline>
+        </w:drawing>
+      </w:r>
     </w:p>
     <w:p>
       <w:pPr>
@@ -7468,7 +7527,6 @@
           <w:b/>
           <w:bCs/>
         </w:rPr>
-        <w:lastRenderedPageBreak/>
         <w:t>Các chức năng chính cho ứng dụng (Mục tiêu của ứng dụng)</w:t>
       </w:r>
     </w:p>
@@ -7525,6 +7583,7 @@
           <w:sz w:val="26"/>
           <w:szCs w:val="26"/>
         </w:rPr>
+        <w:lastRenderedPageBreak/>
         <w:t>Quản lý nhân viên:</w:t>
       </w:r>
       <w:r>
@@ -7815,12 +7874,12 @@
       </w:pPr>
     </w:p>
     <w:sectPr>
-      <w:headerReference w:type="even" r:id="rId8"/>
-      <w:headerReference w:type="default" r:id="rId9"/>
-      <w:footerReference w:type="even" r:id="rId10"/>
-      <w:footerReference w:type="default" r:id="rId11"/>
-      <w:headerReference w:type="first" r:id="rId12"/>
-      <w:footerReference w:type="first" r:id="rId13"/>
+      <w:headerReference w:type="even" r:id="rId9"/>
+      <w:headerReference w:type="default" r:id="rId10"/>
+      <w:footerReference w:type="even" r:id="rId11"/>
+      <w:footerReference w:type="default" r:id="rId12"/>
+      <w:headerReference w:type="first" r:id="rId13"/>
+      <w:footerReference w:type="first" r:id="rId14"/>
       <w:pgSz w:w="12240" w:h="15840" w:code="1"/>
       <w:pgMar w:top="851" w:right="851" w:bottom="851" w:left="1134" w:header="567" w:footer="567" w:gutter="0"/>
       <w:cols w:space="720"/>
@@ -13396,6 +13455,7 @@
   <w:style w:type="character" w:default="1" w:styleId="DefaultParagraphFont">
     <w:name w:val="Default Paragraph Font"/>
     <w:uiPriority w:val="1"/>
+    <w:semiHidden/>
     <w:unhideWhenUsed/>
   </w:style>
   <w:style w:type="table" w:default="1" w:styleId="TableNormal">

</xml_diff>